<commit_message>
COMPLETION of all documents REQ 1
</commit_message>
<xml_diff>
--- a/docs/design/assignment2/REQ1/REQ1-DesignRationale.docx
+++ b/docs/design/assignment2/REQ1/REQ1-DesignRationale.docx
@@ -369,6 +369,7 @@
     <w:p>
       <w:pPr>
         <w:pStyle w:val="Heading1"/>
+        <w:spacing w:line="360" w:lineRule="auto"/>
         <w:rPr/>
       </w:pPr>
       <w:bookmarkStart w:colFirst="0" w:colLast="0" w:name="_yf24mtyvurlr" w:id="3"/>
@@ -383,6 +384,7 @@
     <w:p>
       <w:pPr>
         <w:pStyle w:val="Heading2"/>
+        <w:spacing w:line="360" w:lineRule="auto"/>
         <w:ind w:left="0" w:firstLine="0"/>
         <w:rPr/>
       </w:pPr>
@@ -398,20 +400,24 @@
     <w:p>
       <w:pPr>
         <w:spacing w:line="360" w:lineRule="auto"/>
-        <w:rPr/>
-      </w:pPr>
-      <w:r>
-        <w:rPr/>
+        <w:jc w:val="center"/>
+        <w:rPr/>
+      </w:pPr>
+      <w:r>
+        <w:rPr>
+          <w:sz w:val="40"/>
+          <w:szCs w:val="40"/>
+        </w:rPr>
         <w:drawing>
           <wp:inline distB="114300" distT="114300" distL="114300" distR="114300">
-            <wp:extent cx="5908878" cy="4583798"/>
+            <wp:extent cx="5731200" cy="5143500"/>
             <wp:effectExtent b="0" l="0" r="0" t="0"/>
-            <wp:docPr id="2" name="image2.png"/>
+            <wp:docPr id="1" name="image1.png"/>
             <a:graphic>
               <a:graphicData uri="http://schemas.openxmlformats.org/drawingml/2006/picture">
                 <pic:pic>
                   <pic:nvPicPr>
-                    <pic:cNvPr id="0" name="image2.png"/>
+                    <pic:cNvPr id="0" name="image1.png"/>
                     <pic:cNvPicPr preferRelativeResize="0"/>
                   </pic:nvPicPr>
                   <pic:blipFill>
@@ -424,7 +430,7 @@
                   <pic:spPr>
                     <a:xfrm>
                       <a:off x="0" y="0"/>
-                      <a:ext cx="5908878" cy="4583798"/>
+                      <a:ext cx="5731200" cy="5143500"/>
                     </a:xfrm>
                     <a:prstGeom prst="rect"/>
                     <a:ln/>
@@ -444,6 +450,7 @@
     <w:p>
       <w:pPr>
         <w:pStyle w:val="Heading2"/>
+        <w:spacing w:line="360" w:lineRule="auto"/>
         <w:ind w:firstLine="0"/>
         <w:rPr/>
       </w:pPr>
@@ -465,14 +472,14 @@
         <w:rPr/>
         <w:drawing>
           <wp:inline distB="114300" distT="114300" distL="114300" distR="114300">
-            <wp:extent cx="5934075" cy="4465342"/>
+            <wp:extent cx="5731200" cy="3975100"/>
             <wp:effectExtent b="0" l="0" r="0" t="0"/>
-            <wp:docPr id="1" name="image1.png"/>
+            <wp:docPr id="2" name="image2.png"/>
             <a:graphic>
               <a:graphicData uri="http://schemas.openxmlformats.org/drawingml/2006/picture">
                 <pic:pic>
                   <pic:nvPicPr>
-                    <pic:cNvPr id="0" name="image1.png"/>
+                    <pic:cNvPr id="0" name="image2.png"/>
                     <pic:cNvPicPr preferRelativeResize="0"/>
                   </pic:nvPicPr>
                   <pic:blipFill>
@@ -485,7 +492,7 @@
                   <pic:spPr>
                     <a:xfrm>
                       <a:off x="0" y="0"/>
-                      <a:ext cx="5934075" cy="4465342"/>
+                      <a:ext cx="5731200" cy="3975100"/>
                     </a:xfrm>
                     <a:prstGeom prst="rect"/>
                     <a:ln/>
@@ -662,6 +669,7 @@
     <w:p>
       <w:pPr>
         <w:pStyle w:val="Heading2"/>
+        <w:spacing w:line="360" w:lineRule="auto"/>
         <w:rPr/>
       </w:pPr>
       <w:bookmarkStart w:colFirst="0" w:colLast="0" w:name="_dfvkds26igxb" w:id="7"/>
@@ -724,150 +732,6 @@
         <w:rPr>
           <w:sz w:val="24"/>
           <w:szCs w:val="24"/>
-        </w:rPr>
-      </w:pPr>
-      <w:r>
-        <w:rPr>
-          <w:sz w:val="24"/>
-          <w:szCs w:val="24"/>
-          <w:rtl w:val="0"/>
-        </w:rPr>
-        <w:t xml:space="preserve">In this design, the SuperComputer holds its catalogue as a List&lt;Supplier&lt;Buyable&gt;&gt; rather than a list of fixed item instances. Each entry in the list is a small factory that produces a fresh Buyable when called. The constructor takes this list as a parameter, and a static defaultCatalogue() method on SuperComputer provides the standard line-up of items that EclipseNebula uses when registering the terminal on the map.</w:t>
-      </w:r>
-    </w:p>
-    <w:p>
-      <w:pPr>
-        <w:spacing w:after="120" w:line="360" w:lineRule="auto"/>
-        <w:ind w:left="720" w:firstLine="0"/>
-        <w:jc w:val="both"/>
-        <w:rPr>
-          <w:sz w:val="24"/>
-          <w:szCs w:val="24"/>
-        </w:rPr>
-      </w:pPr>
-      <w:r>
-        <w:rPr>
-          <w:rtl w:val="0"/>
-        </w:rPr>
-      </w:r>
-    </w:p>
-    <w:p>
-      <w:pPr>
-        <w:spacing w:after="120" w:line="360" w:lineRule="auto"/>
-        <w:ind w:left="720" w:firstLine="0"/>
-        <w:jc w:val="both"/>
-        <w:rPr>
-          <w:sz w:val="24"/>
-          <w:szCs w:val="24"/>
-        </w:rPr>
-      </w:pPr>
-      <w:r>
-        <w:rPr>
-          <w:sz w:val="24"/>
-          <w:szCs w:val="24"/>
-          <w:rtl w:val="0"/>
-        </w:rPr>
-        <w:t xml:space="preserve">When the engine asks the terminal for actions through allowableActions(), the SuperComputer iterates over the list, calls each supplier to create a new Buyable, and wraps it in a BuyAction. This means the terminal never holds the items themselves; it only holds the recipes for making them. As a result, every purchase produces a brand new instance, which avoids the situation where two actors would otherwise share the same item reference.</w:t>
-      </w:r>
-    </w:p>
-    <w:p>
-      <w:pPr>
-        <w:spacing w:after="120" w:line="360" w:lineRule="auto"/>
-        <w:ind w:left="720" w:firstLine="0"/>
-        <w:jc w:val="both"/>
-        <w:rPr>
-          <w:sz w:val="24"/>
-          <w:szCs w:val="24"/>
-        </w:rPr>
-      </w:pPr>
-      <w:r>
-        <w:rPr>
-          <w:rtl w:val="0"/>
-        </w:rPr>
-      </w:r>
-    </w:p>
-    <w:p>
-      <w:pPr>
-        <w:spacing w:after="120" w:line="360" w:lineRule="auto"/>
-        <w:ind w:left="720" w:firstLine="0"/>
-        <w:jc w:val="both"/>
-        <w:rPr/>
-      </w:pPr>
-      <w:r>
-        <w:rPr>
-          <w:sz w:val="24"/>
-          <w:szCs w:val="24"/>
-          <w:rtl w:val="0"/>
-        </w:rPr>
-        <w:t xml:space="preserve">The catalogue is also typed against the Buyable interface rather than any specific item class. Anything that implements Buyable can be added to the catalogue without changing the SuperComputer. This keeps the terminal completely unaware of how individual items behave or what side-effects they trigger, and lets new items join the catalogue by being added to the static factory method rather than by editing the terminal itself.</w:t>
-      </w:r>
-      <w:r>
-        <w:rPr>
-          <w:rtl w:val="0"/>
-        </w:rPr>
-        <w:br w:type="textWrapping"/>
-      </w:r>
-    </w:p>
-    <w:p>
-      <w:pPr>
-        <w:spacing w:after="120" w:line="360" w:lineRule="auto"/>
-        <w:ind w:left="720" w:firstLine="0"/>
-        <w:jc w:val="both"/>
-        <w:rPr/>
-      </w:pPr>
-      <w:r>
-        <w:rPr>
-          <w:rtl w:val="0"/>
-        </w:rPr>
-      </w:r>
-    </w:p>
-    <w:p>
-      <w:pPr>
-        <w:spacing w:after="120" w:line="360" w:lineRule="auto"/>
-        <w:ind w:left="720" w:firstLine="0"/>
-        <w:jc w:val="both"/>
-        <w:rPr/>
-      </w:pPr>
-      <w:r>
-        <w:rPr>
-          <w:rtl w:val="0"/>
-        </w:rPr>
-      </w:r>
-    </w:p>
-    <w:p>
-      <w:pPr>
-        <w:spacing w:after="120" w:line="360" w:lineRule="auto"/>
-        <w:ind w:left="720" w:firstLine="0"/>
-        <w:jc w:val="both"/>
-        <w:rPr/>
-      </w:pPr>
-      <w:r>
-        <w:rPr>
-          <w:rtl w:val="0"/>
-        </w:rPr>
-      </w:r>
-    </w:p>
-    <w:p>
-      <w:pPr>
-        <w:spacing w:after="120" w:line="360" w:lineRule="auto"/>
-        <w:ind w:left="0" w:firstLine="0"/>
-        <w:jc w:val="both"/>
-        <w:rPr/>
-      </w:pPr>
-      <w:r>
-        <w:rPr>
-          <w:rtl w:val="0"/>
-        </w:rPr>
-      </w:r>
-    </w:p>
-    <w:p>
-      <w:pPr>
-        <w:spacing w:line="360" w:lineRule="auto"/>
-        <w:ind w:left="720" w:firstLine="0"/>
-        <w:jc w:val="both"/>
-        <w:rPr>
-          <w:sz w:val="24"/>
-          <w:szCs w:val="24"/>
           <w:u w:val="single"/>
         </w:rPr>
       </w:pPr>
@@ -875,10 +739,14 @@
         <w:rPr>
           <w:sz w:val="24"/>
           <w:szCs w:val="24"/>
-          <w:u w:val="single"/>
-          <w:rtl w:val="0"/>
-        </w:rPr>
-        <w:t xml:space="preserve">PROS &amp; CONS of Design 1</w:t>
+          <w:rtl w:val="0"/>
+        </w:rPr>
+        <w:t xml:space="preserve">The SuperComputer holds its catalogue as a list of suppliers, each producing a fresh Buyable item on demand. The catalogue is typed against the Buyable interface, so the terminal never needs to know the concrete type of any item it stocks. This means new items can be added to the catalogue without touching the SuperComputer class at all.</w:t>
+      </w:r>
+      <w:r>
+        <w:rPr>
+          <w:rtl w:val="0"/>
+        </w:rPr>
       </w:r>
     </w:p>
     <w:p>
@@ -1215,15 +1083,15 @@
                 <w:u w:val="single"/>
                 <w:rtl w:val="0"/>
               </w:rPr>
-              <w:t xml:space="preserve">Uses generic types (Supplier&lt;Buyable&gt;), </w:t>
-            </w:r>
-            <w:r>
-              <w:rPr>
-                <w:sz w:val="24"/>
-                <w:szCs w:val="24"/>
-                <w:rtl w:val="0"/>
-              </w:rPr>
-              <w:t xml:space="preserve">which may be slightly less familiar to read than a plain item list.</w:t>
+              <w:t xml:space="preserve">Uses generic supplier types</w:t>
+            </w:r>
+            <w:r>
+              <w:rPr>
+                <w:sz w:val="24"/>
+                <w:szCs w:val="24"/>
+                <w:rtl w:val="0"/>
+              </w:rPr>
+              <w:t xml:space="preserve">, which may be slightly less familiar to read than a plain item list.</w:t>
             </w:r>
           </w:p>
         </w:tc>
@@ -1291,163 +1159,6 @@
           <w:rtl w:val="0"/>
         </w:rPr>
         <w:br w:type="textWrapping"/>
-      </w:r>
-    </w:p>
-    <w:p>
-      <w:pPr>
-        <w:spacing w:after="120" w:line="360" w:lineRule="auto"/>
-        <w:ind w:left="720" w:firstLine="0"/>
-        <w:jc w:val="both"/>
-        <w:rPr/>
-      </w:pPr>
-      <w:r>
-        <w:rPr>
-          <w:rtl w:val="0"/>
-        </w:rPr>
-      </w:r>
-    </w:p>
-    <w:p>
-      <w:pPr>
-        <w:spacing w:line="360" w:lineRule="auto"/>
-        <w:ind w:left="720" w:firstLine="0"/>
-        <w:jc w:val="both"/>
-        <w:rPr>
-          <w:sz w:val="24"/>
-          <w:szCs w:val="24"/>
-        </w:rPr>
-      </w:pPr>
-      <w:r>
-        <w:rPr>
-          <w:rtl w:val="0"/>
-        </w:rPr>
-      </w:r>
-    </w:p>
-    <w:p>
-      <w:pPr>
-        <w:spacing w:line="360" w:lineRule="auto"/>
-        <w:ind w:left="720" w:firstLine="0"/>
-        <w:jc w:val="both"/>
-        <w:rPr>
-          <w:sz w:val="24"/>
-          <w:szCs w:val="24"/>
-        </w:rPr>
-      </w:pPr>
-      <w:r>
-        <w:rPr>
-          <w:rtl w:val="0"/>
-        </w:rPr>
-      </w:r>
-    </w:p>
-    <w:p>
-      <w:pPr>
-        <w:spacing w:line="360" w:lineRule="auto"/>
-        <w:ind w:left="720" w:firstLine="0"/>
-        <w:jc w:val="both"/>
-        <w:rPr>
-          <w:sz w:val="24"/>
-          <w:szCs w:val="24"/>
-        </w:rPr>
-      </w:pPr>
-      <w:r>
-        <w:rPr>
-          <w:rtl w:val="0"/>
-        </w:rPr>
-      </w:r>
-    </w:p>
-    <w:p>
-      <w:pPr>
-        <w:spacing w:line="360" w:lineRule="auto"/>
-        <w:ind w:left="720" w:firstLine="0"/>
-        <w:jc w:val="both"/>
-        <w:rPr>
-          <w:sz w:val="24"/>
-          <w:szCs w:val="24"/>
-        </w:rPr>
-      </w:pPr>
-      <w:r>
-        <w:rPr>
-          <w:rtl w:val="0"/>
-        </w:rPr>
-      </w:r>
-    </w:p>
-    <w:p>
-      <w:pPr>
-        <w:spacing w:line="360" w:lineRule="auto"/>
-        <w:ind w:left="720" w:firstLine="0"/>
-        <w:jc w:val="both"/>
-        <w:rPr>
-          <w:sz w:val="24"/>
-          <w:szCs w:val="24"/>
-        </w:rPr>
-      </w:pPr>
-      <w:r>
-        <w:rPr>
-          <w:rtl w:val="0"/>
-        </w:rPr>
-      </w:r>
-    </w:p>
-    <w:p>
-      <w:pPr>
-        <w:spacing w:line="360" w:lineRule="auto"/>
-        <w:ind w:left="720" w:firstLine="0"/>
-        <w:jc w:val="both"/>
-        <w:rPr>
-          <w:sz w:val="24"/>
-          <w:szCs w:val="24"/>
-        </w:rPr>
-      </w:pPr>
-      <w:r>
-        <w:rPr>
-          <w:rtl w:val="0"/>
-        </w:rPr>
-      </w:r>
-    </w:p>
-    <w:p>
-      <w:pPr>
-        <w:spacing w:line="360" w:lineRule="auto"/>
-        <w:ind w:left="720" w:firstLine="0"/>
-        <w:jc w:val="both"/>
-        <w:rPr>
-          <w:sz w:val="24"/>
-          <w:szCs w:val="24"/>
-        </w:rPr>
-      </w:pPr>
-      <w:r>
-        <w:rPr>
-          <w:rtl w:val="0"/>
-        </w:rPr>
-      </w:r>
-    </w:p>
-    <w:p>
-      <w:pPr>
-        <w:spacing w:line="360" w:lineRule="auto"/>
-        <w:ind w:left="720" w:firstLine="0"/>
-        <w:jc w:val="both"/>
-        <w:rPr>
-          <w:sz w:val="24"/>
-          <w:szCs w:val="24"/>
-        </w:rPr>
-      </w:pPr>
-      <w:r>
-        <w:rPr>
-          <w:rtl w:val="0"/>
-        </w:rPr>
-      </w:r>
-    </w:p>
-    <w:p>
-      <w:pPr>
-        <w:spacing w:line="360" w:lineRule="auto"/>
-        <w:ind w:left="720" w:firstLine="0"/>
-        <w:jc w:val="both"/>
-        <w:rPr>
-          <w:sz w:val="24"/>
-          <w:szCs w:val="24"/>
-        </w:rPr>
-      </w:pPr>
-      <w:r>
-        <w:rPr>
-          <w:rtl w:val="0"/>
-        </w:rPr>
       </w:r>
     </w:p>
     <w:p>
@@ -1864,124 +1575,58 @@
     <w:p>
       <w:pPr>
         <w:spacing w:line="360" w:lineRule="auto"/>
-        <w:ind w:left="720" w:firstLine="0"/>
-        <w:jc w:val="both"/>
-        <w:rPr>
-          <w:sz w:val="24"/>
-          <w:szCs w:val="24"/>
-        </w:rPr>
-      </w:pPr>
-      <w:r>
-        <w:rPr>
-          <w:rtl w:val="0"/>
-        </w:rPr>
-      </w:r>
-    </w:p>
-    <w:p>
-      <w:pPr>
-        <w:pStyle w:val="Heading3"/>
-        <w:spacing w:before="280" w:line="360" w:lineRule="auto"/>
-        <w:ind w:left="720" w:firstLine="0"/>
-        <w:jc w:val="both"/>
-        <w:rPr>
-          <w:color w:val="000000"/>
-          <w:sz w:val="24"/>
-          <w:szCs w:val="24"/>
-          <w:u w:val="single"/>
-        </w:rPr>
-      </w:pPr>
-      <w:bookmarkStart w:colFirst="0" w:colLast="0" w:name="_y67n7dqrk24g" w:id="10"/>
-      <w:bookmarkEnd w:id="10"/>
-      <w:r>
-        <w:rPr>
-          <w:rtl w:val="0"/>
-        </w:rPr>
-      </w:r>
-    </w:p>
-    <w:p>
-      <w:pPr>
-        <w:spacing w:line="360" w:lineRule="auto"/>
-        <w:ind w:left="720" w:firstLine="0"/>
-        <w:jc w:val="both"/>
-        <w:rPr>
-          <w:sz w:val="24"/>
-          <w:szCs w:val="24"/>
-        </w:rPr>
-      </w:pPr>
-      <w:r>
-        <w:rPr>
-          <w:rtl w:val="0"/>
-        </w:rPr>
-      </w:r>
-    </w:p>
-    <w:p>
-      <w:pPr>
-        <w:spacing w:line="360" w:lineRule="auto"/>
-        <w:ind w:left="720" w:firstLine="0"/>
-        <w:jc w:val="both"/>
-        <w:rPr>
-          <w:sz w:val="24"/>
-          <w:szCs w:val="24"/>
-        </w:rPr>
-      </w:pPr>
-      <w:r>
-        <w:rPr>
-          <w:rtl w:val="0"/>
-        </w:rPr>
-      </w:r>
-    </w:p>
-    <w:p>
-      <w:pPr>
-        <w:spacing w:line="360" w:lineRule="auto"/>
-        <w:ind w:left="720" w:firstLine="0"/>
-        <w:jc w:val="both"/>
-        <w:rPr>
-          <w:sz w:val="24"/>
-          <w:szCs w:val="24"/>
-        </w:rPr>
-      </w:pPr>
-      <w:r>
-        <w:rPr>
-          <w:rtl w:val="0"/>
-        </w:rPr>
-      </w:r>
-    </w:p>
-    <w:p>
-      <w:pPr>
-        <w:spacing w:line="360" w:lineRule="auto"/>
-        <w:ind w:left="720" w:firstLine="0"/>
-        <w:jc w:val="both"/>
-        <w:rPr>
-          <w:sz w:val="24"/>
-          <w:szCs w:val="24"/>
-        </w:rPr>
-      </w:pPr>
-      <w:r>
-        <w:rPr>
-          <w:rtl w:val="0"/>
-        </w:rPr>
-      </w:r>
-    </w:p>
-    <w:p>
-      <w:pPr>
-        <w:spacing w:line="360" w:lineRule="auto"/>
-        <w:ind w:left="720" w:firstLine="0"/>
-        <w:jc w:val="both"/>
-        <w:rPr>
-          <w:sz w:val="24"/>
-          <w:szCs w:val="24"/>
-        </w:rPr>
-      </w:pPr>
-      <w:r>
-        <w:rPr>
-          <w:rtl w:val="0"/>
-        </w:rPr>
-      </w:r>
-    </w:p>
-    <w:p>
-      <w:pPr>
-        <w:spacing w:line="360" w:lineRule="auto"/>
-        <w:ind w:left="720" w:firstLine="0"/>
+        <w:ind w:left="0" w:firstLine="0"/>
+        <w:jc w:val="both"/>
+        <w:rPr>
+          <w:sz w:val="24"/>
+          <w:szCs w:val="24"/>
+        </w:rPr>
+      </w:pPr>
+      <w:r>
+        <w:rPr>
+          <w:rtl w:val="0"/>
+        </w:rPr>
+      </w:r>
+    </w:p>
+    <w:p>
+      <w:pPr>
+        <w:spacing w:line="360" w:lineRule="auto"/>
+        <w:ind w:left="720" w:firstLine="0"/>
+        <w:jc w:val="both"/>
+        <w:rPr>
+          <w:sz w:val="24"/>
+          <w:szCs w:val="24"/>
+        </w:rPr>
+      </w:pPr>
+      <w:r>
+        <w:rPr>
+          <w:sz w:val="24"/>
+          <w:szCs w:val="24"/>
+          <w:rtl w:val="0"/>
+        </w:rPr>
+        <w:t xml:space="preserve">Design 1 is used because it decouples the catalogue from the terminal through dependency injection. Adding a new purchasable item only requires extending the static factory method, without modifying SuperComputer’s core logic (Open-Closed Principle). In contrast, Design 2 would tightly couple the terminal to every item class, forcing edits whenever a new item is introduced and reducing the ability to test the terminal independently.</w:t>
+      </w:r>
+    </w:p>
+    <w:p>
+      <w:pPr>
+        <w:spacing w:line="360" w:lineRule="auto"/>
+        <w:ind w:left="720" w:firstLine="0"/>
+        <w:jc w:val="both"/>
+        <w:rPr>
+          <w:sz w:val="24"/>
+          <w:szCs w:val="24"/>
+        </w:rPr>
+      </w:pPr>
+      <w:r>
+        <w:rPr>
+          <w:rtl w:val="0"/>
+        </w:rPr>
+      </w:r>
+    </w:p>
+    <w:p>
+      <w:pPr>
+        <w:spacing w:line="360" w:lineRule="auto"/>
+        <w:ind w:left="0" w:firstLine="0"/>
         <w:jc w:val="both"/>
         <w:rPr>
           <w:sz w:val="24"/>
@@ -2007,8 +1652,8 @@
           <w:szCs w:val="24"/>
         </w:rPr>
       </w:pPr>
-      <w:bookmarkStart w:colFirst="0" w:colLast="0" w:name="_4pa52u658x5p" w:id="11"/>
-      <w:bookmarkEnd w:id="11"/>
+      <w:bookmarkStart w:colFirst="0" w:colLast="0" w:name="_4pa52u658x5p" w:id="10"/>
+      <w:bookmarkEnd w:id="10"/>
       <w:r>
         <w:rPr>
           <w:rtl w:val="0"/>
@@ -2033,8 +1678,8 @@
         <w:jc w:val="left"/>
         <w:rPr/>
       </w:pPr>
-      <w:bookmarkStart w:colFirst="0" w:colLast="0" w:name="_f1qjlgj3kmr6" w:id="12"/>
-      <w:bookmarkEnd w:id="12"/>
+      <w:bookmarkStart w:colFirst="0" w:colLast="0" w:name="_f1qjlgj3kmr6" w:id="11"/>
+      <w:bookmarkEnd w:id="11"/>
       <w:r>
         <w:rPr>
           <w:rtl w:val="0"/>
@@ -2073,7 +1718,7 @@
           <w:szCs w:val="24"/>
           <w:rtl w:val="0"/>
         </w:rPr>
-        <w:t xml:space="preserve">In this design, the ability to be purchased or sold is treated as a capability rather than an identity. The Buyable interface declares the contract any purchasable item must satisfy (buyPrice, boughtBy, cannotAfford), and the Sellable interface does the same for anything that can be sold (sellPrice, soldBy). Each concrete item implements whichever interface applies to it, so FirstAidKit, SterilisationBox, and AccessCard implement Buyable, while Apple, CookiePack, Lantern, FloppyDisk, and CrtMonitor implement Sellable.</w:t>
+        <w:t xml:space="preserve">The ability to be purchased or sold is treated as a capability rather than an inherent property. The Buyable interface provides the contract for purchasable items, while the Sellable interface provides the equivalent for sellable items. Each concrete item implements whichever interface applies; FirstAidKit, SterilisationBox, and AccessCard implement Buyable, while Apple, CookiePack, Lantern, FloppyDisk, and CRTMonitor implement Sellable.</w:t>
       </w:r>
     </w:p>
     <w:p>
@@ -2092,32 +1737,29 @@
           <w:szCs w:val="24"/>
           <w:rtl w:val="0"/>
         </w:rPr>
-        <w:t xml:space="preserve">BuyAction and SellAction are written against these interfaces, not against concrete item classes. BuyAction holds a Buyable field, calls buyPrice(actor) to get the cost, and then moves credits by writing directly to the actor's CREDITS statistic (actor.modifyStatistic(EclipseStatistics.CREDITS, DECREASE, price)). Once the price is deducted, BuyAction delegates the rest of the purchase logic to boughtBy(actor, map). SellAction works in mirror image with a Sellable field, sellPrice, the same modifyStatistic call but with INCREASE, and finally soldBy. Because both actions only ever see the interface, a single BuyAction class can purchase every type of buyable item and a single SellAction class can sell every type of sellable item.</w:t>
+        <w:t xml:space="preserve">BuyAction and SellAction are written against these interfaces rather than concrete item classes. BuyAction orchestrates the purchase by checking the item’s price, verifying the actor has sufficient credits, deducting the cost, and delegating item-specific effects to the item’s boughtBy method. This keeps the action layer generic; BuyAction never needs to know whether it is handling a FirstAidKit or an AccessCard. Item-specific behaviour lives entirely inside each item’s boughtBy or soldBy method, so the action classes remain free of type checks and branching logic.</w:t>
       </w:r>
     </w:p>
     <w:p>
       <w:pPr>
         <w:spacing w:after="160" w:line="360" w:lineRule="auto"/>
-        <w:ind w:left="720" w:firstLine="0"/>
-        <w:jc w:val="both"/>
-        <w:rPr>
-          <w:sz w:val="24"/>
-          <w:szCs w:val="24"/>
-        </w:rPr>
-      </w:pPr>
-      <w:r>
-        <w:rPr>
-          <w:sz w:val="24"/>
-          <w:szCs w:val="24"/>
-          <w:rtl w:val="0"/>
-        </w:rPr>
-        <w:t xml:space="preserve">Item-specific behaviour, such as the FirstAidKit hurting a broke buyer, the SterilisationBox destroying a random inventory slot, or the Lantern starting nearby fires, lives inside each item's own boughtBy or soldBy method. The action classes never inspect what type of item they are dealing with; the item itself decides what happens. This keeps BuyAction and SellAction free of any item-specific branching.</w:t>
+        <w:ind w:left="0" w:firstLine="0"/>
+        <w:jc w:val="both"/>
+        <w:rPr>
+          <w:sz w:val="24"/>
+          <w:szCs w:val="24"/>
+        </w:rPr>
+      </w:pPr>
+      <w:r>
+        <w:rPr>
+          <w:rtl w:val="0"/>
+        </w:rPr>
       </w:r>
     </w:p>
     <w:p>
       <w:pPr>
         <w:spacing w:after="160" w:line="360" w:lineRule="auto"/>
-        <w:ind w:left="720" w:firstLine="0"/>
+        <w:ind w:left="0" w:firstLine="0"/>
         <w:jc w:val="both"/>
         <w:rPr>
           <w:sz w:val="24"/>
@@ -2133,7 +1775,103 @@
     <w:p>
       <w:pPr>
         <w:spacing w:after="160" w:line="360" w:lineRule="auto"/>
-        <w:ind w:left="720" w:firstLine="0"/>
+        <w:ind w:left="0" w:firstLine="0"/>
+        <w:jc w:val="both"/>
+        <w:rPr>
+          <w:sz w:val="24"/>
+          <w:szCs w:val="24"/>
+        </w:rPr>
+      </w:pPr>
+      <w:r>
+        <w:rPr>
+          <w:rtl w:val="0"/>
+        </w:rPr>
+      </w:r>
+    </w:p>
+    <w:p>
+      <w:pPr>
+        <w:spacing w:after="160" w:line="360" w:lineRule="auto"/>
+        <w:ind w:left="0" w:firstLine="0"/>
+        <w:jc w:val="both"/>
+        <w:rPr>
+          <w:sz w:val="24"/>
+          <w:szCs w:val="24"/>
+        </w:rPr>
+      </w:pPr>
+      <w:r>
+        <w:rPr>
+          <w:rtl w:val="0"/>
+        </w:rPr>
+      </w:r>
+    </w:p>
+    <w:p>
+      <w:pPr>
+        <w:spacing w:after="160" w:line="360" w:lineRule="auto"/>
+        <w:ind w:left="0" w:firstLine="0"/>
+        <w:jc w:val="both"/>
+        <w:rPr>
+          <w:sz w:val="24"/>
+          <w:szCs w:val="24"/>
+        </w:rPr>
+      </w:pPr>
+      <w:r>
+        <w:rPr>
+          <w:rtl w:val="0"/>
+        </w:rPr>
+      </w:r>
+    </w:p>
+    <w:p>
+      <w:pPr>
+        <w:spacing w:after="160" w:line="360" w:lineRule="auto"/>
+        <w:ind w:left="0" w:firstLine="0"/>
+        <w:jc w:val="both"/>
+        <w:rPr>
+          <w:sz w:val="24"/>
+          <w:szCs w:val="24"/>
+        </w:rPr>
+      </w:pPr>
+      <w:r>
+        <w:rPr>
+          <w:rtl w:val="0"/>
+        </w:rPr>
+      </w:r>
+    </w:p>
+    <w:p>
+      <w:pPr>
+        <w:spacing w:after="160" w:line="360" w:lineRule="auto"/>
+        <w:ind w:left="0" w:firstLine="0"/>
+        <w:jc w:val="both"/>
+        <w:rPr>
+          <w:sz w:val="24"/>
+          <w:szCs w:val="24"/>
+        </w:rPr>
+      </w:pPr>
+      <w:r>
+        <w:rPr>
+          <w:rtl w:val="0"/>
+        </w:rPr>
+      </w:r>
+    </w:p>
+    <w:p>
+      <w:pPr>
+        <w:spacing w:after="160" w:line="360" w:lineRule="auto"/>
+        <w:ind w:left="0" w:firstLine="0"/>
+        <w:jc w:val="both"/>
+        <w:rPr>
+          <w:sz w:val="24"/>
+          <w:szCs w:val="24"/>
+        </w:rPr>
+      </w:pPr>
+      <w:r>
+        <w:rPr>
+          <w:rtl w:val="0"/>
+        </w:rPr>
+      </w:r>
+    </w:p>
+    <w:p>
+      <w:pPr>
+        <w:spacing w:after="160" w:line="360" w:lineRule="auto"/>
+        <w:ind w:left="0" w:firstLine="0"/>
         <w:jc w:val="both"/>
         <w:rPr>
           <w:sz w:val="24"/>
@@ -2517,15 +2255,15 @@
                 <w:u w:val="single"/>
                 <w:rtl w:val="0"/>
               </w:rPr>
-              <w:t xml:space="preserve">Splits behaviour across two files (action and item), </w:t>
-            </w:r>
-            <w:r>
-              <w:rPr>
-                <w:sz w:val="24"/>
-                <w:szCs w:val="24"/>
-                <w:rtl w:val="0"/>
-              </w:rPr>
-              <w:t xml:space="preserve">which may need both to be opened when tracing a purchase end to end.</w:t>
+              <w:t xml:space="preserve">Requires reading both the action class and the item class</w:t>
+            </w:r>
+            <w:r>
+              <w:rPr>
+                <w:sz w:val="24"/>
+                <w:szCs w:val="24"/>
+                <w:rtl w:val="0"/>
+              </w:rPr>
+              <w:t xml:space="preserve"> to trace a complete transaction, which adds one extra file to navigate</w:t>
             </w:r>
           </w:p>
         </w:tc>
@@ -2737,12 +2475,13 @@
     </w:p>
     <w:p>
       <w:pPr>
-        <w:spacing w:after="160" w:line="360" w:lineRule="auto"/>
-        <w:ind w:left="0" w:firstLine="0"/>
-        <w:jc w:val="both"/>
-        <w:rPr>
-          <w:sz w:val="24"/>
-          <w:szCs w:val="24"/>
+        <w:spacing w:line="360" w:lineRule="auto"/>
+        <w:ind w:left="720" w:firstLine="0"/>
+        <w:jc w:val="both"/>
+        <w:rPr>
+          <w:sz w:val="24"/>
+          <w:szCs w:val="24"/>
+          <w:u w:val="single"/>
         </w:rPr>
       </w:pPr>
       <w:r>
@@ -2758,8 +2497,8 @@
         <w:ind w:firstLine="720"/>
         <w:rPr/>
       </w:pPr>
-      <w:bookmarkStart w:colFirst="0" w:colLast="0" w:name="_8mo63c2zb7zp" w:id="13"/>
-      <w:bookmarkEnd w:id="13"/>
+      <w:bookmarkStart w:colFirst="0" w:colLast="0" w:name="_8mo63c2zb7zp" w:id="12"/>
+      <w:bookmarkEnd w:id="12"/>
       <w:r>
         <w:rPr>
           <w:rtl w:val="0"/>
@@ -2784,7 +2523,7 @@
           <w:szCs w:val="24"/>
           <w:rtl w:val="0"/>
         </w:rPr>
-        <w:t xml:space="preserve">In this design, every purchasable item would have its own dedicated action class, such as BuyFirstAidKitAction or BuySterilisationBoxAction, and the same pattern would be repeated for selling. Each subclass would hard-code which item it deals with and implement that item's side-effects directly inside execute().</w:t>
+        <w:t xml:space="preserve">Every purchasable item would have its own dedicated action class (e.g., BuyFirstAidKitAction, BuySterilisationBoxAction), with item-specific logic implemented directly inside execute().</w:t>
       </w:r>
       <w:r>
         <w:rPr>
@@ -3144,16 +2883,20 @@
     <w:p>
       <w:pPr>
         <w:spacing w:line="360" w:lineRule="auto"/>
-        <w:rPr>
-          <w:sz w:val="24"/>
-          <w:szCs w:val="24"/>
-          <w:u w:val="single"/>
-        </w:rPr>
-      </w:pPr>
-      <w:r>
-        <w:rPr>
-          <w:rtl w:val="0"/>
-        </w:rPr>
+        <w:ind w:left="720" w:firstLine="0"/>
+        <w:jc w:val="both"/>
+        <w:rPr>
+          <w:sz w:val="24"/>
+          <w:szCs w:val="24"/>
+        </w:rPr>
+      </w:pPr>
+      <w:r>
+        <w:rPr>
+          <w:sz w:val="24"/>
+          <w:szCs w:val="24"/>
+          <w:rtl w:val="0"/>
+        </w:rPr>
+        <w:t xml:space="preserve">Design 1 is used because it eliminates duplicated action classes, with one BuyAction handling every purchasable item and one SellAction handling every sellable item. Unlike Design 2, this avoids repeating the same transaction logic across many action subclasses (DRY). Actions depend on abstractions rather than concrete item classes, which reduces the coupling between the action layer and individual items (Dependency Inversion Principle).</w:t>
       </w:r>
     </w:p>
     <w:p>
@@ -3178,41 +2921,8 @@
           <w:szCs w:val="24"/>
         </w:rPr>
       </w:pPr>
-      <w:bookmarkStart w:colFirst="0" w:colLast="0" w:name="_p7k3rw8rvo4r" w:id="14"/>
-      <w:bookmarkEnd w:id="14"/>
-      <w:r>
-        <w:rPr>
-          <w:rtl w:val="0"/>
-        </w:rPr>
-      </w:r>
-    </w:p>
-    <w:p>
-      <w:pPr>
-        <w:spacing w:line="360" w:lineRule="auto"/>
-        <w:rPr/>
-      </w:pPr>
-      <w:r>
-        <w:rPr>
-          <w:rtl w:val="0"/>
-        </w:rPr>
-      </w:r>
-    </w:p>
-    <w:p>
-      <w:pPr>
-        <w:spacing w:line="360" w:lineRule="auto"/>
-        <w:rPr/>
-      </w:pPr>
-      <w:r>
-        <w:rPr>
-          <w:rtl w:val="0"/>
-        </w:rPr>
-      </w:r>
-    </w:p>
-    <w:p>
-      <w:pPr>
-        <w:spacing w:line="360" w:lineRule="auto"/>
-        <w:rPr/>
-      </w:pPr>
+      <w:bookmarkStart w:colFirst="0" w:colLast="0" w:name="_p7k3rw8rvo4r" w:id="13"/>
+      <w:bookmarkEnd w:id="13"/>
       <w:r>
         <w:rPr>
           <w:rtl w:val="0"/>
@@ -3259,8 +2969,8 @@
         <w:ind w:left="720" w:firstLine="0"/>
         <w:rPr/>
       </w:pPr>
-      <w:bookmarkStart w:colFirst="0" w:colLast="0" w:name="_gipls3stjli0" w:id="15"/>
-      <w:bookmarkEnd w:id="15"/>
+      <w:bookmarkStart w:colFirst="0" w:colLast="0" w:name="_gipls3stjli0" w:id="14"/>
+      <w:bookmarkEnd w:id="14"/>
       <w:r>
         <w:rPr>
           <w:rtl w:val="0"/>
@@ -3275,8 +2985,8 @@
         <w:ind w:left="720" w:firstLine="0"/>
         <w:rPr/>
       </w:pPr>
-      <w:bookmarkStart w:colFirst="0" w:colLast="0" w:name="_ahwlaiub6td" w:id="16"/>
-      <w:bookmarkEnd w:id="16"/>
+      <w:bookmarkStart w:colFirst="0" w:colLast="0" w:name="_ahwlaiub6td" w:id="15"/>
+      <w:bookmarkEnd w:id="15"/>
       <w:r>
         <w:rPr>
           <w:rtl w:val="0"/>
@@ -3300,7 +3010,7 @@
           <w:szCs w:val="24"/>
           <w:rtl w:val="0"/>
         </w:rPr>
-        <w:t xml:space="preserve">Several items in the catalogue apply effects to the seller or buyer. Selling an Apple poisons the seller, selling a Lantern sets them on fire, selling a FloppyDisk costs them credits, and selling a CrtMonitor places Fires on adjacent tiles. To express these outcomes consistently, each effect is modelled as a Status that the engine already knows how to tick. PoisonStatus and BurnStatus both implement the engine's Status interface, so they are processed by the engine's existing per-turn machinery rather than by any custom code in the actor.</w:t>
+        <w:t xml:space="preserve">Item side-effects (poison, burn, fire) are modelled as Status objects that integrate with the engine’s existing per-turn lifecycle, so effects expire and apply damage automatically without any custom tracking code in the actor. Actors declare which effects they can receive through capability interfaces (Poisonable, Flammable). Items query whether an actor supports a given capability before applying an effect, avoiding type checks against concrete actor classes. Environmental effects such as Fire spawning on adjacent tiles are treated as ordinary items added to the map through the engine’s existing item-placement system, keeping the effects model consistent across the whole codebase.</w:t>
       </w:r>
     </w:p>
     <w:p>
@@ -3319,7 +3029,7 @@
           <w:szCs w:val="24"/>
           <w:rtl w:val="0"/>
         </w:rPr>
-        <w:t xml:space="preserve">The actor exposes its eligibility for each effect through small capability interfaces. EclipseActor implements Poisonable and Flammable, which means an item can ask the actor for the corresponding capability through asCapability(Poisonable.class) before applying the status. If the actor does not satisfy the capability, the effect is simply not applied, and no exception is thrown. This keeps the item from needing to know what concrete type of actor it is interacting with.</w:t>
+        <w:t xml:space="preserve">Note that item prices and side-effect values (e.g., poison duration, burn damage, spawn chances) have been declared as named constants within each item class rather than hardcoded literals scattered throughout methods. This eliminates connascence of meaning, changing it into connascence of name (weaker), improving readability and maintainability. For example, if Apple’s poison effect needs adjustment, modifying a single constant ensures consistency rather than hunting through multiple method calls.</w:t>
       </w:r>
     </w:p>
     <w:p>
@@ -3334,11 +3044,40 @@
       </w:pPr>
       <w:r>
         <w:rPr>
-          <w:sz w:val="24"/>
-          <w:szCs w:val="24"/>
-          <w:rtl w:val="0"/>
-        </w:rPr>
-        <w:t xml:space="preserve">Side-effects that involve the environment, such as the Lantern and CrtMonitor spawning Fire on adjacent tiles, are also expressed in terms of items rather than special cases. Fire is an ordinary EclipseItem that is added to a Location through the engine's existing addItem call. Because Status objects manage their own lifetime and Fire is just another item on the map, no part of the actor needs to manually count turns or clean anything up.</w:t>
+          <w:rtl w:val="0"/>
+        </w:rPr>
+      </w:r>
+    </w:p>
+    <w:p>
+      <w:pPr>
+        <w:spacing w:after="160" w:line="360" w:lineRule="auto"/>
+        <w:ind w:left="720" w:firstLine="0"/>
+        <w:jc w:val="both"/>
+        <w:rPr>
+          <w:sz w:val="24"/>
+          <w:szCs w:val="24"/>
+        </w:rPr>
+      </w:pPr>
+      <w:r>
+        <w:rPr>
+          <w:rtl w:val="0"/>
+        </w:rPr>
+      </w:r>
+    </w:p>
+    <w:p>
+      <w:pPr>
+        <w:spacing w:after="160" w:line="360" w:lineRule="auto"/>
+        <w:ind w:left="720" w:firstLine="0"/>
+        <w:jc w:val="both"/>
+        <w:rPr>
+          <w:sz w:val="24"/>
+          <w:szCs w:val="24"/>
+        </w:rPr>
+      </w:pPr>
+      <w:r>
+        <w:rPr>
+          <w:rtl w:val="0"/>
+        </w:rPr>
       </w:r>
     </w:p>
     <w:p>
@@ -3792,7 +3531,7 @@
                 <w:u w:val="single"/>
                 <w:rtl w:val="0"/>
               </w:rPr>
-              <w:t xml:space="preserve">Means side-effects are spread across several small classes </w:t>
+              <w:t xml:space="preserve">Side-effects are spread across several small classes </w:t>
             </w:r>
             <w:r>
               <w:rPr>
@@ -3936,39 +3675,23 @@
     </w:p>
     <w:p>
       <w:pPr>
-        <w:spacing w:after="160" w:line="360" w:lineRule="auto"/>
-        <w:ind w:left="720" w:firstLine="0"/>
-        <w:jc w:val="both"/>
-        <w:rPr>
-          <w:sz w:val="24"/>
-          <w:szCs w:val="24"/>
-        </w:rPr>
-      </w:pPr>
-      <w:r>
-        <w:rPr>
-          <w:rtl w:val="0"/>
-        </w:rPr>
-      </w:r>
-    </w:p>
-    <w:p>
-      <w:pPr>
-        <w:spacing w:after="160" w:line="360" w:lineRule="auto"/>
-        <w:ind w:left="720" w:firstLine="0"/>
-        <w:jc w:val="both"/>
-        <w:rPr>
-          <w:sz w:val="24"/>
-          <w:szCs w:val="24"/>
-        </w:rPr>
-      </w:pPr>
-      <w:r>
-        <w:rPr>
-          <w:rtl w:val="0"/>
-        </w:rPr>
-      </w:r>
-    </w:p>
-    <w:p>
-      <w:pPr>
-        <w:spacing w:after="160" w:line="360" w:lineRule="auto"/>
+        <w:spacing w:line="360" w:lineRule="auto"/>
+        <w:ind w:left="720" w:firstLine="0"/>
+        <w:jc w:val="both"/>
+        <w:rPr>
+          <w:sz w:val="24"/>
+          <w:szCs w:val="24"/>
+        </w:rPr>
+      </w:pPr>
+      <w:r>
+        <w:rPr>
+          <w:rtl w:val="0"/>
+        </w:rPr>
+      </w:r>
+    </w:p>
+    <w:p>
+      <w:pPr>
+        <w:spacing w:line="360" w:lineRule="auto"/>
         <w:ind w:left="720" w:firstLine="0"/>
         <w:jc w:val="both"/>
         <w:rPr>
@@ -4004,8 +3727,8 @@
         <w:spacing w:line="360" w:lineRule="auto"/>
         <w:rPr/>
       </w:pPr>
-      <w:bookmarkStart w:colFirst="0" w:colLast="0" w:name="_546vnebplb5o" w:id="17"/>
-      <w:bookmarkEnd w:id="17"/>
+      <w:bookmarkStart w:colFirst="0" w:colLast="0" w:name="_546vnebplb5o" w:id="16"/>
+      <w:bookmarkEnd w:id="16"/>
       <w:r>
         <w:rPr>
           <w:rtl w:val="0"/>
@@ -4030,8 +3753,7 @@
           <w:szCs w:val="24"/>
           <w:rtl w:val="0"/>
         </w:rPr>
-        <w:t xml:space="preserve">In this design, each effect would be its own dedicated class (such as PoisonEffect and BurnEffect) and would be held in a collection on the actor. The actor would iterate over this collection each turn and call an apply method on every effect to reduce duration and apply damage.</w:t>
-        <w:tab/>
+        <w:t xml:space="preserve">Each effect would be its own dedicated class (e.g., PoisonEffect, BurnEffect) held in a collection on the actor. The actor would iterate over this collection each turn, applying damage and reducing duration manually.</w:t>
       </w:r>
       <w:r>
         <w:rPr>
@@ -4164,15 +3886,15 @@
                 <w:u w:val="single"/>
                 <w:rtl w:val="0"/>
               </w:rPr>
-              <w:t xml:space="preserve">Reuses the engine's tick lifecycle, </w:t>
-            </w:r>
-            <w:r>
-              <w:rPr>
-                <w:sz w:val="24"/>
-                <w:szCs w:val="24"/>
-                <w:rtl w:val="0"/>
-              </w:rPr>
-              <w:t xml:space="preserve">so effects expire automatically without any per-turn bookkeeping inside the actor.</w:t>
+              <w:t xml:space="preserve">Behaviour for each effect </w:t>
+            </w:r>
+            <w:r>
+              <w:rPr>
+                <w:sz w:val="24"/>
+                <w:szCs w:val="24"/>
+                <w:rtl w:val="0"/>
+              </w:rPr>
+              <w:t xml:space="preserve">lives in one self-contained class.</w:t>
             </w:r>
           </w:p>
         </w:tc>
@@ -4200,15 +3922,15 @@
                 <w:u w:val="single"/>
                 <w:rtl w:val="0"/>
               </w:rPr>
-              <w:t xml:space="preserve">Adds extra interfaces (Poisonable, Flammable), </w:t>
-            </w:r>
-            <w:r>
-              <w:rPr>
-                <w:sz w:val="24"/>
-                <w:szCs w:val="24"/>
-                <w:rtl w:val="0"/>
-              </w:rPr>
-              <w:t xml:space="preserve">which the actor must implement to be a valid target.</w:t>
+              <w:t xml:space="preserve">Forces the actor to manage effect lifecycles manually</w:t>
+            </w:r>
+            <w:r>
+              <w:rPr>
+                <w:sz w:val="24"/>
+                <w:szCs w:val="24"/>
+                <w:rtl w:val="0"/>
+              </w:rPr>
+              <w:t xml:space="preserve">, duplicating logic the engine already provides through Status.</w:t>
             </w:r>
           </w:p>
         </w:tc>
@@ -4242,15 +3964,15 @@
                 <w:u w:val="single"/>
                 <w:rtl w:val="0"/>
               </w:rPr>
-              <w:t xml:space="preserve">Decouples items from concrete actor types </w:t>
-            </w:r>
-            <w:r>
-              <w:rPr>
-                <w:sz w:val="24"/>
-                <w:szCs w:val="24"/>
-                <w:rtl w:val="0"/>
-              </w:rPr>
-              <w:t xml:space="preserve">by routing every effect through a capability lookup rather than a class check.</w:t>
+              <w:t xml:space="preserve">Avoids the engine's status system</w:t>
+            </w:r>
+            <w:r>
+              <w:rPr>
+                <w:sz w:val="24"/>
+                <w:szCs w:val="24"/>
+                <w:rtl w:val="0"/>
+              </w:rPr>
+              <w:t xml:space="preserve">, which may feel more lightweight at first.</w:t>
             </w:r>
           </w:p>
         </w:tc>
@@ -4278,15 +4000,15 @@
                 <w:u w:val="single"/>
                 <w:rtl w:val="0"/>
               </w:rPr>
-              <w:t xml:space="preserve">Requires an effect-application path </w:t>
-            </w:r>
-            <w:r>
-              <w:rPr>
-                <w:sz w:val="24"/>
-                <w:szCs w:val="24"/>
-                <w:rtl w:val="0"/>
-              </w:rPr>
-              <w:t xml:space="preserve">for each new status, since the actor must declare the matching capability.</w:t>
+              <w:t xml:space="preserve">Bypasses an engine feature</w:t>
+            </w:r>
+            <w:r>
+              <w:rPr>
+                <w:sz w:val="24"/>
+                <w:szCs w:val="24"/>
+                <w:rtl w:val="0"/>
+              </w:rPr>
+              <w:t xml:space="preserve"> that exists precisely for this purpose, reducing consistency with the rest of the codebase.</w:t>
             </w:r>
           </w:p>
         </w:tc>
@@ -4320,15 +4042,15 @@
                 <w:u w:val="single"/>
                 <w:rtl w:val="0"/>
               </w:rPr>
-              <w:t xml:space="preserve">Keeps environmental effects (fire on adjacent tiles) </w:t>
-            </w:r>
-            <w:r>
-              <w:rPr>
-                <w:sz w:val="24"/>
-                <w:szCs w:val="24"/>
-                <w:rtl w:val="0"/>
-              </w:rPr>
-              <w:t xml:space="preserve">consistent with normal item placement, avoiding a separate effects subsystem.</w:t>
+              <w:t xml:space="preserve">Effects are easy to find </w:t>
+            </w:r>
+            <w:r>
+              <w:rPr>
+                <w:sz w:val="24"/>
+                <w:szCs w:val="24"/>
+                <w:rtl w:val="0"/>
+              </w:rPr>
+              <w:t xml:space="preserve">because they all sit in the actor's effect list.</w:t>
             </w:r>
           </w:p>
         </w:tc>
@@ -4356,15 +4078,15 @@
                 <w:u w:val="single"/>
                 <w:rtl w:val="0"/>
               </w:rPr>
-              <w:t xml:space="preserve">Means side-effects are spread across several small classes </w:t>
-            </w:r>
-            <w:r>
-              <w:rPr>
-                <w:sz w:val="24"/>
-                <w:szCs w:val="24"/>
-                <w:rtl w:val="0"/>
-              </w:rPr>
-              <w:t xml:space="preserve">rather than living in one place.</w:t>
+              <w:t xml:space="preserve">Makes the actor responsible</w:t>
+            </w:r>
+            <w:r>
+              <w:rPr>
+                <w:sz w:val="24"/>
+                <w:szCs w:val="24"/>
+                <w:rtl w:val="0"/>
+              </w:rPr>
+              <w:t xml:space="preserve"> for every effect type, so adding new effects forces the actor class to grow.</w:t>
             </w:r>
           </w:p>
         </w:tc>
@@ -4404,66 +4126,21 @@
     </w:p>
     <w:p>
       <w:pPr>
-        <w:spacing w:line="360" w:lineRule="auto"/>
-        <w:ind w:left="720" w:firstLine="0"/>
-        <w:jc w:val="both"/>
-        <w:rPr>
-          <w:sz w:val="24"/>
-          <w:szCs w:val="24"/>
-        </w:rPr>
-      </w:pPr>
-      <w:r>
-        <w:rPr>
-          <w:rtl w:val="0"/>
-        </w:rPr>
-      </w:r>
-    </w:p>
-    <w:p>
-      <w:pPr>
         <w:spacing w:after="160" w:line="360" w:lineRule="auto"/>
-        <w:ind w:left="0" w:firstLine="0"/>
-        <w:jc w:val="both"/>
-        <w:rPr>
-          <w:sz w:val="24"/>
-          <w:szCs w:val="24"/>
-        </w:rPr>
-      </w:pPr>
-      <w:r>
-        <w:rPr>
-          <w:rtl w:val="0"/>
-        </w:rPr>
-      </w:r>
-    </w:p>
-    <w:p>
-      <w:pPr>
-        <w:spacing w:after="160" w:line="360" w:lineRule="auto"/>
-        <w:ind w:left="0" w:firstLine="0"/>
-        <w:jc w:val="both"/>
-        <w:rPr>
-          <w:sz w:val="24"/>
-          <w:szCs w:val="24"/>
-        </w:rPr>
-      </w:pPr>
-      <w:r>
-        <w:rPr>
-          <w:rtl w:val="0"/>
-        </w:rPr>
-      </w:r>
-    </w:p>
-    <w:p>
-      <w:pPr>
-        <w:spacing w:after="160" w:line="360" w:lineRule="auto"/>
-        <w:ind w:left="0" w:firstLine="0"/>
-        <w:jc w:val="both"/>
-        <w:rPr>
-          <w:sz w:val="24"/>
-          <w:szCs w:val="24"/>
-        </w:rPr>
-      </w:pPr>
-      <w:r>
-        <w:rPr>
-          <w:rtl w:val="0"/>
-        </w:rPr>
+        <w:ind w:left="720" w:firstLine="0"/>
+        <w:jc w:val="both"/>
+        <w:rPr>
+          <w:sz w:val="24"/>
+          <w:szCs w:val="24"/>
+        </w:rPr>
+      </w:pPr>
+      <w:r>
+        <w:rPr>
+          <w:sz w:val="24"/>
+          <w:szCs w:val="24"/>
+          <w:rtl w:val="0"/>
+        </w:rPr>
+        <w:t xml:space="preserve">Design 1 is used because it reuses the engine’s existing Status lifecycle, avoiding the need to reimplement per-turn tracking and cleanup in the actor (DRY). It also decouples items from concrete actor types by routing effects through capability interfaces, which makes adding new effects more straightforward. Design 2 would require the actor to manually manage every effect’s duration and damage, duplicating logic the engine already handles correctly.</w:t>
       </w:r>
     </w:p>
     <w:p>
@@ -4489,27 +4166,27 @@
         <w:ind w:firstLine="720"/>
         <w:rPr/>
       </w:pPr>
-      <w:bookmarkStart w:colFirst="0" w:colLast="0" w:name="_eopg0278p1qr" w:id="18"/>
+      <w:bookmarkStart w:colFirst="0" w:colLast="0" w:name="_eopg0278p1qr" w:id="17"/>
+      <w:bookmarkEnd w:id="17"/>
+      <w:r>
+        <w:rPr>
+          <w:rtl w:val="0"/>
+        </w:rPr>
+        <w:t xml:space="preserve">D. Access Card Hierarchy</w:t>
+      </w:r>
+    </w:p>
+    <w:p>
+      <w:pPr>
+        <w:pStyle w:val="Heading3"/>
+        <w:spacing w:line="360" w:lineRule="auto"/>
+        <w:rPr/>
+      </w:pPr>
+      <w:bookmarkStart w:colFirst="0" w:colLast="0" w:name="_adf2vbm3jc6x" w:id="18"/>
       <w:bookmarkEnd w:id="18"/>
       <w:r>
         <w:rPr>
           <w:rtl w:val="0"/>
         </w:rPr>
-        <w:t xml:space="preserve">D. Access Card Hierarchy</w:t>
-      </w:r>
-    </w:p>
-    <w:p>
-      <w:pPr>
-        <w:pStyle w:val="Heading3"/>
-        <w:spacing w:line="360" w:lineRule="auto"/>
-        <w:rPr/>
-      </w:pPr>
-      <w:bookmarkStart w:colFirst="0" w:colLast="0" w:name="_adf2vbm3jc6x" w:id="19"/>
-      <w:bookmarkEnd w:id="19"/>
-      <w:r>
-        <w:rPr>
-          <w:rtl w:val="0"/>
-        </w:rPr>
         <w:t xml:space="preserve">Design 1: Abstract AccessCard with Tier-Specific Subclasses (Implemented Design)</w:t>
       </w:r>
     </w:p>
@@ -4540,127 +4217,318 @@
           <w:szCs w:val="24"/>
           <w:rtl w:val="0"/>
         </w:rPr>
-        <w:t xml:space="preserve">Access cards come in three clearance levels, each with the same overall purpose but with different costs and different side-effects on purchase. To capture this shared structure, AccessCard is modelled as an abstract class that implements Buyable and stores the clearance tier as an ItemStatistics.CLEARANCE_LEVEL statistic on the item itself. The three concrete subclasses, AccessCardL1, AccessCardL2, and AccessCardL3, each pass their own tier value (1, 2, or 3) into the AccessCard constructor and override boughtBy to encode the behaviour that makes them distinct.</w:t>
-      </w:r>
-    </w:p>
-    <w:p>
-      <w:pPr>
-        <w:spacing w:line="360" w:lineRule="auto"/>
-        <w:ind w:left="720" w:firstLine="0"/>
-        <w:jc w:val="both"/>
-        <w:rPr>
-          <w:sz w:val="24"/>
-          <w:szCs w:val="24"/>
-        </w:rPr>
-      </w:pPr>
-      <w:r>
-        <w:rPr>
-          <w:rtl w:val="0"/>
-        </w:rPr>
-      </w:r>
-    </w:p>
-    <w:p>
-      <w:pPr>
-        <w:spacing w:line="360" w:lineRule="auto"/>
-        <w:ind w:left="720" w:firstLine="0"/>
-        <w:jc w:val="both"/>
-        <w:rPr>
-          <w:sz w:val="24"/>
-          <w:szCs w:val="24"/>
-        </w:rPr>
-      </w:pPr>
-      <w:r>
-        <w:rPr>
-          <w:sz w:val="24"/>
-          <w:szCs w:val="24"/>
-          <w:rtl w:val="0"/>
-        </w:rPr>
-        <w:t xml:space="preserve">AccessCardL2 hurts the buyer for a fixed blood-sample amount as part of boughtBy, while AccessCardL3 has a chance to charge a hidden fee on top of the listed price by writing directly to the buyer's EclipseStatistics.CREDITS statistic. AccessCardL1 has no side-effect and just lands in the inventory. The clearance tier is exposed to the rest of the game through a single getter, getClearanceLevel(), which simply reads the underlying statistic. This means REQ2 doors can ask "how strong is this card?" without ever inspecting the card's runtime class.</w:t>
-      </w:r>
-    </w:p>
-    <w:p>
-      <w:pPr>
-        <w:spacing w:line="360" w:lineRule="auto"/>
-        <w:ind w:left="720" w:firstLine="0"/>
-        <w:jc w:val="both"/>
-        <w:rPr>
-          <w:sz w:val="24"/>
-          <w:szCs w:val="24"/>
-        </w:rPr>
-      </w:pPr>
-      <w:r>
-        <w:rPr>
-          <w:rtl w:val="0"/>
-        </w:rPr>
-      </w:r>
-    </w:p>
-    <w:p>
-      <w:pPr>
-        <w:spacing w:line="360" w:lineRule="auto"/>
-        <w:ind w:left="720" w:firstLine="0"/>
-        <w:jc w:val="both"/>
-        <w:rPr>
-          <w:sz w:val="24"/>
-          <w:szCs w:val="24"/>
-        </w:rPr>
-      </w:pPr>
-      <w:r>
-        <w:rPr>
-          <w:sz w:val="24"/>
-          <w:szCs w:val="24"/>
-          <w:rtl w:val="0"/>
-        </w:rPr>
-        <w:t xml:space="preserve">This arrangement keeps each card's individual logic in its own subclass while sharing everything that is genuinely common (the cost, the symbol, the clearance statistic, the Buyable contract, the inheritance from EclipseItem) in the abstract parent. Adding a future card tier would mean adding one new subclass and choosing one new integer for the statistic, with no change required to the SuperComputer or to BuyAction.</w:t>
-      </w:r>
-    </w:p>
-    <w:p>
-      <w:pPr>
-        <w:spacing w:line="360" w:lineRule="auto"/>
-        <w:jc w:val="both"/>
-        <w:rPr/>
-      </w:pPr>
-      <w:r>
-        <w:rPr>
-          <w:rtl w:val="0"/>
-        </w:rPr>
-      </w:r>
-    </w:p>
-    <w:p>
-      <w:pPr>
-        <w:spacing w:line="360" w:lineRule="auto"/>
-        <w:rPr/>
-      </w:pPr>
-      <w:r>
-        <w:rPr>
-          <w:rtl w:val="0"/>
-        </w:rPr>
-      </w:r>
-    </w:p>
-    <w:p>
-      <w:pPr>
-        <w:spacing w:line="360" w:lineRule="auto"/>
-        <w:rPr/>
-      </w:pPr>
-      <w:r>
-        <w:rPr>
-          <w:rtl w:val="0"/>
-        </w:rPr>
-      </w:r>
-    </w:p>
-    <w:p>
-      <w:pPr>
-        <w:spacing w:line="360" w:lineRule="auto"/>
-        <w:rPr/>
-      </w:pPr>
-      <w:r>
-        <w:rPr>
-          <w:rtl w:val="0"/>
-        </w:rPr>
-      </w:r>
-    </w:p>
-    <w:p>
-      <w:pPr>
-        <w:spacing w:line="360" w:lineRule="auto"/>
+        <w:t xml:space="preserve">AccessCard is modelled as an abstract class that implements Buyable, with three concrete subclasses (AccessCardL1, AccessCardL2, AccessCardL3). Each subclass inherits shared state (price, weight, clearance level) from the parent and overrides boughtBy to define tier-specific purchase effects. AccessCardL2 deducts health from the buyer as a blood-sample fee, and AccessCardL3 has a 50% chance to charge a hidden fee on top of the purchase price. AccessCardL1 has no side-effect and simply enters the inventory. The clearance level is exposed through a single getter, allowing REQ2 doors to check a card’s tier without inspecting its runtime class.</w:t>
+      </w:r>
+    </w:p>
+    <w:p>
+      <w:pPr>
+        <w:spacing w:line="360" w:lineRule="auto"/>
+        <w:ind w:left="720" w:firstLine="0"/>
+        <w:jc w:val="both"/>
+        <w:rPr>
+          <w:sz w:val="24"/>
+          <w:szCs w:val="24"/>
+        </w:rPr>
+      </w:pPr>
+      <w:r>
+        <w:rPr>
+          <w:rtl w:val="0"/>
+        </w:rPr>
+      </w:r>
+    </w:p>
+    <w:p>
+      <w:pPr>
+        <w:spacing w:line="360" w:lineRule="auto"/>
+        <w:ind w:left="720" w:firstLine="0"/>
+        <w:jc w:val="both"/>
+        <w:rPr>
+          <w:sz w:val="24"/>
+          <w:szCs w:val="24"/>
+        </w:rPr>
+      </w:pPr>
+      <w:r>
+        <w:rPr>
+          <w:rtl w:val="0"/>
+        </w:rPr>
+      </w:r>
+    </w:p>
+    <w:p>
+      <w:pPr>
+        <w:spacing w:line="360" w:lineRule="auto"/>
+        <w:ind w:left="720" w:firstLine="0"/>
+        <w:jc w:val="both"/>
+        <w:rPr>
+          <w:sz w:val="24"/>
+          <w:szCs w:val="24"/>
+        </w:rPr>
+      </w:pPr>
+      <w:r>
+        <w:rPr>
+          <w:rtl w:val="0"/>
+        </w:rPr>
+      </w:r>
+    </w:p>
+    <w:p>
+      <w:pPr>
+        <w:spacing w:line="360" w:lineRule="auto"/>
+        <w:ind w:left="720" w:firstLine="0"/>
+        <w:jc w:val="both"/>
+        <w:rPr>
+          <w:sz w:val="24"/>
+          <w:szCs w:val="24"/>
+        </w:rPr>
+      </w:pPr>
+      <w:r>
+        <w:rPr>
+          <w:rtl w:val="0"/>
+        </w:rPr>
+      </w:r>
+    </w:p>
+    <w:p>
+      <w:pPr>
+        <w:spacing w:line="360" w:lineRule="auto"/>
+        <w:ind w:left="720" w:firstLine="0"/>
+        <w:jc w:val="both"/>
+        <w:rPr>
+          <w:sz w:val="24"/>
+          <w:szCs w:val="24"/>
+        </w:rPr>
+      </w:pPr>
+      <w:r>
+        <w:rPr>
+          <w:rtl w:val="0"/>
+        </w:rPr>
+      </w:r>
+    </w:p>
+    <w:p>
+      <w:pPr>
+        <w:spacing w:line="360" w:lineRule="auto"/>
+        <w:ind w:left="720" w:firstLine="0"/>
+        <w:jc w:val="both"/>
+        <w:rPr>
+          <w:sz w:val="24"/>
+          <w:szCs w:val="24"/>
+        </w:rPr>
+      </w:pPr>
+      <w:r>
+        <w:rPr>
+          <w:rtl w:val="0"/>
+        </w:rPr>
+      </w:r>
+    </w:p>
+    <w:p>
+      <w:pPr>
+        <w:spacing w:line="360" w:lineRule="auto"/>
+        <w:ind w:left="720" w:firstLine="0"/>
+        <w:jc w:val="both"/>
+        <w:rPr>
+          <w:sz w:val="24"/>
+          <w:szCs w:val="24"/>
+        </w:rPr>
+      </w:pPr>
+      <w:r>
+        <w:rPr>
+          <w:rtl w:val="0"/>
+        </w:rPr>
+      </w:r>
+    </w:p>
+    <w:p>
+      <w:pPr>
+        <w:spacing w:line="360" w:lineRule="auto"/>
+        <w:ind w:left="720" w:firstLine="0"/>
+        <w:jc w:val="both"/>
+        <w:rPr>
+          <w:sz w:val="24"/>
+          <w:szCs w:val="24"/>
+        </w:rPr>
+      </w:pPr>
+      <w:r>
+        <w:rPr>
+          <w:rtl w:val="0"/>
+        </w:rPr>
+      </w:r>
+    </w:p>
+    <w:p>
+      <w:pPr>
+        <w:spacing w:line="360" w:lineRule="auto"/>
+        <w:ind w:left="720" w:firstLine="0"/>
+        <w:jc w:val="both"/>
+        <w:rPr>
+          <w:sz w:val="24"/>
+          <w:szCs w:val="24"/>
+        </w:rPr>
+      </w:pPr>
+      <w:r>
+        <w:rPr>
+          <w:rtl w:val="0"/>
+        </w:rPr>
+      </w:r>
+    </w:p>
+    <w:p>
+      <w:pPr>
+        <w:spacing w:line="360" w:lineRule="auto"/>
+        <w:ind w:left="720" w:firstLine="0"/>
+        <w:jc w:val="both"/>
+        <w:rPr>
+          <w:sz w:val="24"/>
+          <w:szCs w:val="24"/>
+        </w:rPr>
+      </w:pPr>
+      <w:r>
+        <w:rPr>
+          <w:rtl w:val="0"/>
+        </w:rPr>
+      </w:r>
+    </w:p>
+    <w:p>
+      <w:pPr>
+        <w:spacing w:line="360" w:lineRule="auto"/>
+        <w:ind w:left="720" w:firstLine="0"/>
+        <w:jc w:val="both"/>
+        <w:rPr>
+          <w:sz w:val="24"/>
+          <w:szCs w:val="24"/>
+        </w:rPr>
+      </w:pPr>
+      <w:r>
+        <w:rPr>
+          <w:rtl w:val="0"/>
+        </w:rPr>
+      </w:r>
+    </w:p>
+    <w:p>
+      <w:pPr>
+        <w:spacing w:line="360" w:lineRule="auto"/>
+        <w:ind w:left="720" w:firstLine="0"/>
+        <w:jc w:val="both"/>
+        <w:rPr>
+          <w:sz w:val="24"/>
+          <w:szCs w:val="24"/>
+        </w:rPr>
+      </w:pPr>
+      <w:r>
+        <w:rPr>
+          <w:rtl w:val="0"/>
+        </w:rPr>
+      </w:r>
+    </w:p>
+    <w:p>
+      <w:pPr>
+        <w:spacing w:line="360" w:lineRule="auto"/>
+        <w:ind w:left="720" w:firstLine="0"/>
+        <w:jc w:val="both"/>
+        <w:rPr>
+          <w:sz w:val="24"/>
+          <w:szCs w:val="24"/>
+        </w:rPr>
+      </w:pPr>
+      <w:r>
+        <w:rPr>
+          <w:rtl w:val="0"/>
+        </w:rPr>
+      </w:r>
+    </w:p>
+    <w:p>
+      <w:pPr>
+        <w:spacing w:line="360" w:lineRule="auto"/>
+        <w:ind w:left="720" w:firstLine="0"/>
+        <w:jc w:val="both"/>
+        <w:rPr>
+          <w:sz w:val="24"/>
+          <w:szCs w:val="24"/>
+        </w:rPr>
+      </w:pPr>
+      <w:r>
+        <w:rPr>
+          <w:rtl w:val="0"/>
+        </w:rPr>
+      </w:r>
+    </w:p>
+    <w:p>
+      <w:pPr>
+        <w:spacing w:line="360" w:lineRule="auto"/>
+        <w:ind w:left="720" w:firstLine="0"/>
+        <w:jc w:val="both"/>
+        <w:rPr>
+          <w:sz w:val="24"/>
+          <w:szCs w:val="24"/>
+        </w:rPr>
+      </w:pPr>
+      <w:r>
+        <w:rPr>
+          <w:rtl w:val="0"/>
+        </w:rPr>
+      </w:r>
+    </w:p>
+    <w:p>
+      <w:pPr>
+        <w:spacing w:line="360" w:lineRule="auto"/>
+        <w:ind w:left="720" w:firstLine="0"/>
+        <w:jc w:val="both"/>
+        <w:rPr>
+          <w:sz w:val="24"/>
+          <w:szCs w:val="24"/>
+        </w:rPr>
+      </w:pPr>
+      <w:r>
+        <w:rPr>
+          <w:rtl w:val="0"/>
+        </w:rPr>
+      </w:r>
+    </w:p>
+    <w:p>
+      <w:pPr>
+        <w:spacing w:line="360" w:lineRule="auto"/>
+        <w:ind w:left="720" w:firstLine="0"/>
+        <w:jc w:val="both"/>
+        <w:rPr>
+          <w:sz w:val="24"/>
+          <w:szCs w:val="24"/>
+        </w:rPr>
+      </w:pPr>
+      <w:r>
+        <w:rPr>
+          <w:rtl w:val="0"/>
+        </w:rPr>
+      </w:r>
+    </w:p>
+    <w:p>
+      <w:pPr>
+        <w:spacing w:line="360" w:lineRule="auto"/>
+        <w:ind w:left="720" w:firstLine="0"/>
+        <w:jc w:val="both"/>
+        <w:rPr>
+          <w:sz w:val="24"/>
+          <w:szCs w:val="24"/>
+        </w:rPr>
+      </w:pPr>
+      <w:r>
+        <w:rPr>
+          <w:rtl w:val="0"/>
+        </w:rPr>
+      </w:r>
+    </w:p>
+    <w:p>
+      <w:pPr>
+        <w:spacing w:line="360" w:lineRule="auto"/>
+        <w:ind w:left="720" w:firstLine="0"/>
+        <w:jc w:val="both"/>
+        <w:rPr>
+          <w:sz w:val="24"/>
+          <w:szCs w:val="24"/>
+        </w:rPr>
+      </w:pPr>
+      <w:r>
+        <w:rPr>
+          <w:rtl w:val="0"/>
+        </w:rPr>
+      </w:r>
+    </w:p>
+    <w:p>
+      <w:pPr>
+        <w:spacing w:line="360" w:lineRule="auto"/>
+        <w:ind w:left="720" w:firstLine="0"/>
+        <w:jc w:val="both"/>
         <w:rPr/>
       </w:pPr>
       <w:r>
@@ -5025,15 +4893,15 @@
                 <w:u w:val="single"/>
                 <w:rtl w:val="0"/>
               </w:rPr>
-              <w:t xml:space="preserve">The 'clearance level' is now an integer statistic </w:t>
-            </w:r>
-            <w:r>
-              <w:rPr>
-                <w:sz w:val="24"/>
-                <w:szCs w:val="24"/>
-                <w:rtl w:val="0"/>
-              </w:rPr>
-              <w:t xml:space="preserve">rather than a dedicated enum, which makes it slightly less type-safe than the old approach.</w:t>
+              <w:t xml:space="preserve">Clearance level is stored as an integer statistic</w:t>
+            </w:r>
+            <w:r>
+              <w:rPr>
+                <w:sz w:val="24"/>
+                <w:szCs w:val="24"/>
+                <w:rtl w:val="0"/>
+              </w:rPr>
+              <w:t xml:space="preserve"> rather than a dedicated enum, which is slightly less type-safe but integrates cleanly with the engine's statistic system.</w:t>
             </w:r>
           </w:p>
         </w:tc>
@@ -5054,142 +4922,47 @@
     </w:p>
     <w:p>
       <w:pPr>
-        <w:pStyle w:val="Heading2"/>
         <w:spacing w:after="160" w:before="280" w:line="360" w:lineRule="auto"/>
-        <w:ind w:firstLine="720"/>
-        <w:rPr/>
-      </w:pPr>
-      <w:bookmarkStart w:colFirst="0" w:colLast="0" w:name="_bv30bz7mmi4q" w:id="20"/>
-      <w:bookmarkEnd w:id="20"/>
-      <w:r>
-        <w:rPr>
-          <w:rtl w:val="0"/>
-        </w:rPr>
-      </w:r>
-    </w:p>
-    <w:p>
-      <w:pPr>
-        <w:rPr/>
-      </w:pPr>
-      <w:r>
-        <w:rPr>
-          <w:rtl w:val="0"/>
-        </w:rPr>
-      </w:r>
-    </w:p>
-    <w:p>
-      <w:pPr>
-        <w:rPr/>
-      </w:pPr>
-      <w:r>
-        <w:rPr>
-          <w:rtl w:val="0"/>
-        </w:rPr>
-      </w:r>
-    </w:p>
-    <w:p>
-      <w:pPr>
-        <w:rPr/>
-      </w:pPr>
-      <w:r>
-        <w:rPr>
-          <w:rtl w:val="0"/>
-        </w:rPr>
-      </w:r>
-    </w:p>
-    <w:p>
-      <w:pPr>
-        <w:rPr/>
-      </w:pPr>
-      <w:r>
-        <w:rPr>
-          <w:rtl w:val="0"/>
-        </w:rPr>
-      </w:r>
-    </w:p>
-    <w:p>
-      <w:pPr>
-        <w:rPr/>
-      </w:pPr>
-      <w:r>
-        <w:rPr>
-          <w:rtl w:val="0"/>
-        </w:rPr>
-      </w:r>
-    </w:p>
-    <w:p>
-      <w:pPr>
-        <w:rPr/>
-      </w:pPr>
-      <w:r>
-        <w:rPr>
-          <w:rtl w:val="0"/>
-        </w:rPr>
-      </w:r>
-    </w:p>
-    <w:p>
-      <w:pPr>
-        <w:rPr/>
-      </w:pPr>
-      <w:r>
-        <w:rPr>
-          <w:rtl w:val="0"/>
-        </w:rPr>
-      </w:r>
-    </w:p>
-    <w:p>
-      <w:pPr>
-        <w:rPr/>
-      </w:pPr>
-      <w:r>
-        <w:rPr>
-          <w:rtl w:val="0"/>
-        </w:rPr>
-      </w:r>
-    </w:p>
-    <w:p>
-      <w:pPr>
-        <w:rPr/>
-      </w:pPr>
-      <w:r>
-        <w:rPr>
-          <w:rtl w:val="0"/>
-        </w:rPr>
-      </w:r>
-    </w:p>
-    <w:p>
-      <w:pPr>
-        <w:rPr/>
-      </w:pPr>
-      <w:r>
-        <w:rPr>
-          <w:rtl w:val="0"/>
-        </w:rPr>
-      </w:r>
-    </w:p>
-    <w:p>
-      <w:pPr>
-        <w:rPr/>
-      </w:pPr>
-      <w:r>
-        <w:rPr>
-          <w:rtl w:val="0"/>
-        </w:rPr>
-      </w:r>
-    </w:p>
-    <w:p>
-      <w:pPr>
-        <w:rPr/>
-      </w:pPr>
-      <w:r>
-        <w:rPr>
-          <w:rtl w:val="0"/>
-        </w:rPr>
-      </w:r>
-    </w:p>
-    <w:p>
-      <w:pPr>
-        <w:rPr/>
+        <w:ind w:left="720" w:firstLine="0"/>
+        <w:jc w:val="both"/>
+        <w:rPr>
+          <w:sz w:val="24"/>
+          <w:szCs w:val="24"/>
+        </w:rPr>
+      </w:pPr>
+      <w:r>
+        <w:rPr>
+          <w:sz w:val="24"/>
+          <w:szCs w:val="24"/>
+          <w:rtl w:val="0"/>
+        </w:rPr>
+        <w:t xml:space="preserve">The inheritance hierarchy introduces three classes instead of one, but each subclass isolates tier-specific behaviour (L2's blood sample, L3's hidden fee). This avoids conditional branching inside a single AccessCard class, which would grow messier as new tiers are added. Each tier's logic is easier to test independently, and adding a new tier only requires creating a new subclass without modifying SuperComputer or BuyAction (Open-Closed Principle, Single Responsibility Principle).</w:t>
+      </w:r>
+    </w:p>
+    <w:p>
+      <w:pPr>
+        <w:spacing w:after="160" w:before="280" w:line="360" w:lineRule="auto"/>
+        <w:ind w:left="720" w:firstLine="0"/>
+        <w:jc w:val="both"/>
+        <w:rPr>
+          <w:sz w:val="24"/>
+          <w:szCs w:val="24"/>
+        </w:rPr>
+      </w:pPr>
+      <w:r>
+        <w:rPr>
+          <w:rtl w:val="0"/>
+        </w:rPr>
+      </w:r>
+    </w:p>
+    <w:p>
+      <w:pPr>
+        <w:spacing w:after="160" w:before="280" w:line="360" w:lineRule="auto"/>
+        <w:jc w:val="both"/>
+        <w:rPr>
+          <w:sz w:val="24"/>
+          <w:szCs w:val="24"/>
+        </w:rPr>
       </w:pPr>
       <w:r>
         <w:rPr>
@@ -5200,10 +4973,11 @@
     <w:p>
       <w:pPr>
         <w:pStyle w:val="Heading3"/>
-        <w:rPr/>
-      </w:pPr>
-      <w:bookmarkStart w:colFirst="0" w:colLast="0" w:name="_2w2brn3qigxu" w:id="21"/>
-      <w:bookmarkEnd w:id="21"/>
+        <w:spacing w:line="360" w:lineRule="auto"/>
+        <w:rPr/>
+      </w:pPr>
+      <w:bookmarkStart w:colFirst="0" w:colLast="0" w:name="_2w2brn3qigxu" w:id="19"/>
+      <w:bookmarkEnd w:id="19"/>
       <w:r>
         <w:rPr>
           <w:rtl w:val="0"/>
@@ -5213,6 +4987,7 @@
     </w:p>
     <w:p>
       <w:pPr>
+        <w:spacing w:line="360" w:lineRule="auto"/>
         <w:jc w:val="both"/>
         <w:rPr/>
       </w:pPr>
@@ -5383,15 +5158,15 @@
                 <w:u w:val="single"/>
                 <w:rtl w:val="0"/>
               </w:rPr>
-              <w:t xml:space="preserve">Shares common state and behaviour </w:t>
-            </w:r>
-            <w:r>
-              <w:rPr>
-                <w:sz w:val="24"/>
-                <w:szCs w:val="24"/>
-                <w:rtl w:val="0"/>
-              </w:rPr>
-              <w:t xml:space="preserve">(price, weight, symbol, clearance statistic) through inheritance, avoiding duplication across the three card classes.</w:t>
+              <w:t xml:space="preserve">Fewer classes to maintain</w:t>
+            </w:r>
+            <w:r>
+              <w:rPr>
+                <w:sz w:val="24"/>
+                <w:szCs w:val="24"/>
+                <w:rtl w:val="0"/>
+              </w:rPr>
+              <w:t xml:space="preserve">, with all card logic centralised in one file.</w:t>
             </w:r>
           </w:p>
         </w:tc>
@@ -5419,15 +5194,15 @@
                 <w:u w:val="single"/>
                 <w:rtl w:val="0"/>
               </w:rPr>
-              <w:t xml:space="preserve">Introduces a small class hierarchy </w:t>
-            </w:r>
-            <w:r>
-              <w:rPr>
-                <w:sz w:val="24"/>
-                <w:szCs w:val="24"/>
-                <w:rtl w:val="0"/>
-              </w:rPr>
-              <w:t xml:space="preserve">for what is conceptually a single concept (a card).</w:t>
+              <w:t xml:space="preserve">Centralises behaviour</w:t>
+            </w:r>
+            <w:r>
+              <w:rPr>
+                <w:sz w:val="24"/>
+                <w:szCs w:val="24"/>
+                <w:rtl w:val="0"/>
+              </w:rPr>
+              <w:t xml:space="preserve"> through level branching, which grows messier as new tiers are added.</w:t>
             </w:r>
           </w:p>
         </w:tc>
@@ -5461,15 +5236,15 @@
                 <w:u w:val="single"/>
                 <w:rtl w:val="0"/>
               </w:rPr>
-              <w:t xml:space="preserve">Encapsulates each tier's quirks </w:t>
-            </w:r>
-            <w:r>
-              <w:rPr>
-                <w:sz w:val="24"/>
-                <w:szCs w:val="24"/>
-                <w:rtl w:val="0"/>
-              </w:rPr>
-              <w:t xml:space="preserve">inside its own subclass, keeping behaviour local and easy to find.</w:t>
+              <w:t xml:space="preserve">Easier initial setup</w:t>
+            </w:r>
+            <w:r>
+              <w:rPr>
+                <w:sz w:val="24"/>
+                <w:szCs w:val="24"/>
+                <w:rtl w:val="0"/>
+              </w:rPr>
+              <w:t xml:space="preserve"> because there is no hierarchy to design.</w:t>
             </w:r>
           </w:p>
         </w:tc>
@@ -5497,15 +5272,15 @@
                 <w:u w:val="single"/>
                 <w:rtl w:val="0"/>
               </w:rPr>
-              <w:t xml:space="preserve">Requires a new subclass </w:t>
-            </w:r>
-            <w:r>
-              <w:rPr>
-                <w:sz w:val="24"/>
-                <w:szCs w:val="24"/>
-                <w:rtl w:val="0"/>
-              </w:rPr>
-              <w:t xml:space="preserve">every time a new clearance tier is introduced.</w:t>
+              <w:t xml:space="preserve">Violates the Open-Closed Principle</w:t>
+            </w:r>
+            <w:r>
+              <w:rPr>
+                <w:sz w:val="24"/>
+                <w:szCs w:val="24"/>
+                <w:rtl w:val="0"/>
+              </w:rPr>
+              <w:t xml:space="preserve"> since a new tier forces a change inside the existing class rather than an extension.</w:t>
             </w:r>
           </w:p>
         </w:tc>
@@ -5539,15 +5314,15 @@
                 <w:u w:val="single"/>
                 <w:rtl w:val="0"/>
               </w:rPr>
-              <w:t xml:space="preserve">Exposes clearance level through a single getClearanceLevel() getter </w:t>
-            </w:r>
-            <w:r>
-              <w:rPr>
-                <w:sz w:val="24"/>
-                <w:szCs w:val="24"/>
-                <w:rtl w:val="0"/>
-              </w:rPr>
-              <w:t xml:space="preserve">backed by an ItemStatistics value, so other systems can read a card's tier without inspecting its runtime type.</w:t>
+              <w:t xml:space="preserve">Constructor-driven</w:t>
+            </w:r>
+            <w:r>
+              <w:rPr>
+                <w:sz w:val="24"/>
+                <w:szCs w:val="24"/>
+                <w:rtl w:val="0"/>
+              </w:rPr>
+              <w:t xml:space="preserve">, so creating any tier is a single new statement.</w:t>
             </w:r>
           </w:p>
         </w:tc>
@@ -5575,15 +5350,15 @@
                 <w:u w:val="single"/>
                 <w:rtl w:val="0"/>
               </w:rPr>
-              <w:t xml:space="preserve">The 'clearance level' is now an integer statistic </w:t>
-            </w:r>
-            <w:r>
-              <w:rPr>
-                <w:sz w:val="24"/>
-                <w:szCs w:val="24"/>
-                <w:rtl w:val="0"/>
-              </w:rPr>
-              <w:t xml:space="preserve">rather than a dedicated enum, which makes it slightly less type-safe than the old approach.</w:t>
+              <w:t xml:space="preserve">Mixes concerns inside one class</w:t>
+            </w:r>
+            <w:r>
+              <w:rPr>
+                <w:sz w:val="24"/>
+                <w:szCs w:val="24"/>
+                <w:rtl w:val="0"/>
+              </w:rPr>
+              <w:t xml:space="preserve">, weakening cohesion and making each tier's behaviour harder to locate.</w:t>
             </w:r>
           </w:p>
         </w:tc>
@@ -5607,83 +5382,91 @@
     </w:p>
     <w:p>
       <w:pPr>
-        <w:ind w:left="720" w:firstLine="0"/>
-        <w:rPr/>
-      </w:pPr>
-      <w:r>
-        <w:rPr>
-          <w:rtl w:val="0"/>
-        </w:rPr>
-      </w:r>
-    </w:p>
-    <w:p>
-      <w:pPr>
-        <w:ind w:left="720" w:firstLine="0"/>
-        <w:rPr/>
-      </w:pPr>
-      <w:r>
-        <w:rPr>
-          <w:rtl w:val="0"/>
-        </w:rPr>
-      </w:r>
-    </w:p>
-    <w:p>
-      <w:pPr>
-        <w:ind w:left="720" w:firstLine="0"/>
-        <w:rPr/>
-      </w:pPr>
-      <w:r>
-        <w:rPr>
-          <w:rtl w:val="0"/>
-        </w:rPr>
-      </w:r>
-    </w:p>
-    <w:p>
-      <w:pPr>
-        <w:ind w:left="720" w:firstLine="0"/>
-        <w:rPr/>
-      </w:pPr>
-      <w:r>
-        <w:rPr>
-          <w:rtl w:val="0"/>
-        </w:rPr>
-      </w:r>
-    </w:p>
-    <w:p>
-      <w:pPr>
-        <w:ind w:left="720" w:firstLine="0"/>
-        <w:rPr/>
-      </w:pPr>
-      <w:r>
-        <w:rPr>
-          <w:rtl w:val="0"/>
-        </w:rPr>
-      </w:r>
-    </w:p>
-    <w:p>
-      <w:pPr>
-        <w:ind w:left="720" w:firstLine="0"/>
-        <w:rPr/>
-      </w:pPr>
-      <w:r>
-        <w:rPr>
-          <w:rtl w:val="0"/>
-        </w:rPr>
-      </w:r>
-    </w:p>
-    <w:p>
-      <w:pPr>
-        <w:ind w:left="720" w:firstLine="0"/>
-        <w:rPr/>
-      </w:pPr>
-      <w:r>
-        <w:rPr>
-          <w:rtl w:val="0"/>
-        </w:rPr>
-      </w:r>
-    </w:p>
-    <w:p>
-      <w:pPr>
+        <w:spacing w:line="360" w:lineRule="auto"/>
+        <w:ind w:left="720" w:firstLine="0"/>
+        <w:rPr/>
+      </w:pPr>
+      <w:r>
+        <w:rPr>
+          <w:rtl w:val="0"/>
+        </w:rPr>
+      </w:r>
+    </w:p>
+    <w:p>
+      <w:pPr>
+        <w:spacing w:line="360" w:lineRule="auto"/>
+        <w:ind w:left="720" w:firstLine="0"/>
+        <w:rPr/>
+      </w:pPr>
+      <w:r>
+        <w:rPr>
+          <w:rtl w:val="0"/>
+        </w:rPr>
+      </w:r>
+    </w:p>
+    <w:p>
+      <w:pPr>
+        <w:spacing w:line="360" w:lineRule="auto"/>
+        <w:ind w:left="720" w:firstLine="0"/>
+        <w:rPr/>
+      </w:pPr>
+      <w:r>
+        <w:rPr>
+          <w:rtl w:val="0"/>
+        </w:rPr>
+      </w:r>
+    </w:p>
+    <w:p>
+      <w:pPr>
+        <w:spacing w:line="360" w:lineRule="auto"/>
+        <w:ind w:left="720" w:firstLine="0"/>
+        <w:rPr/>
+      </w:pPr>
+      <w:r>
+        <w:rPr>
+          <w:rtl w:val="0"/>
+        </w:rPr>
+      </w:r>
+    </w:p>
+    <w:p>
+      <w:pPr>
+        <w:spacing w:line="360" w:lineRule="auto"/>
+        <w:ind w:left="720" w:firstLine="0"/>
+        <w:rPr/>
+      </w:pPr>
+      <w:r>
+        <w:rPr>
+          <w:rtl w:val="0"/>
+        </w:rPr>
+      </w:r>
+    </w:p>
+    <w:p>
+      <w:pPr>
+        <w:spacing w:line="360" w:lineRule="auto"/>
+        <w:ind w:left="720" w:firstLine="0"/>
+        <w:rPr/>
+      </w:pPr>
+      <w:r>
+        <w:rPr>
+          <w:rtl w:val="0"/>
+        </w:rPr>
+      </w:r>
+    </w:p>
+    <w:p>
+      <w:pPr>
+        <w:spacing w:line="360" w:lineRule="auto"/>
+        <w:ind w:left="720" w:firstLine="0"/>
+        <w:rPr/>
+      </w:pPr>
+      <w:r>
+        <w:rPr>
+          <w:rtl w:val="0"/>
+        </w:rPr>
+      </w:r>
+    </w:p>
+    <w:p>
+      <w:pPr>
+        <w:spacing w:line="360" w:lineRule="auto"/>
         <w:ind w:left="720" w:firstLine="0"/>
         <w:rPr/>
       </w:pPr>
@@ -5696,12 +5479,13 @@
     <w:p>
       <w:pPr>
         <w:pStyle w:val="Heading1"/>
-        <w:ind w:left="720" w:firstLine="0"/>
+        <w:spacing w:line="360" w:lineRule="auto"/>
+        <w:ind w:left="0" w:firstLine="0"/>
         <w:jc w:val="center"/>
         <w:rPr/>
       </w:pPr>
-      <w:bookmarkStart w:colFirst="0" w:colLast="0" w:name="_v1pqbsvmtnv9" w:id="22"/>
-      <w:bookmarkEnd w:id="22"/>
+      <w:bookmarkStart w:colFirst="0" w:colLast="0" w:name="_v1pqbsvmtnv9" w:id="20"/>
+      <w:bookmarkEnd w:id="20"/>
       <w:r>
         <w:rPr>
           <w:rtl w:val="0"/>
@@ -5711,6 +5495,7 @@
     </w:p>
     <w:p>
       <w:pPr>
+        <w:spacing w:line="360" w:lineRule="auto"/>
         <w:rPr/>
       </w:pPr>
       <w:r>
@@ -5734,7 +5519,25 @@
           <w:szCs w:val="24"/>
           <w:rtl w:val="0"/>
         </w:rPr>
-        <w:t xml:space="preserve">The implemented design treats every part of the SuperComputer transaction as a composition of small, abstraction-driven pieces rather than as one large branching system. The terminal depends only on a list of Buyable suppliers, the action layer depends only on the Buyable and Sellable interfaces, the items themselves carry their own side-effect logic, and the access card tiers are organised through a focused inheritance hierarchy. None of these pieces needs to know the concrete type of the other.</w:t>
+        <w:t xml:space="preserve">The implemented design separates the SuperComputer transaction into small, loosely-coupled components. The terminal presents the catalogue, actions orchestrate credit movement, items handle transaction-specific effects, and the engine's status system manages effect lifetimes; each component interacts through narrow interfaces rather than concrete classes </w:t>
+      </w:r>
+      <w:r>
+        <w:rPr>
+          <w:b w:val="1"/>
+          <w:bCs w:val="1"/>
+          <w:sz w:val="24"/>
+          <w:szCs w:val="24"/>
+          <w:rtl w:val="0"/>
+        </w:rPr>
+        <w:t xml:space="preserve">(Single Responsibility Principle)</w:t>
+      </w:r>
+      <w:r>
+        <w:rPr>
+          <w:sz w:val="24"/>
+          <w:szCs w:val="24"/>
+          <w:rtl w:val="0"/>
+        </w:rPr>
+        <w:t xml:space="preserve">.</w:t>
       </w:r>
     </w:p>
     <w:p>
@@ -5767,89 +5570,77 @@
           <w:szCs w:val="24"/>
           <w:rtl w:val="0"/>
         </w:rPr>
-        <w:t xml:space="preserve">Together, this gives the system a clear separation of responsibilities. The SuperComputer is in charge of presenting a catalogue, the actions are in charge of moving credits, the items are in charge of what happens when a transaction succeeds, and the engine status system is in charge of the lifetime of every effect. Each part can be reasoned about on its own, and the points where they meet are narrow interfaces rather than concrete classes.</w:t>
-      </w:r>
-    </w:p>
-    <w:p>
-      <w:pPr>
-        <w:spacing w:after="160" w:line="360" w:lineRule="auto"/>
-        <w:jc w:val="both"/>
-        <w:rPr>
-          <w:sz w:val="24"/>
-          <w:szCs w:val="24"/>
-        </w:rPr>
-      </w:pPr>
-      <w:r>
-        <w:rPr>
-          <w:rtl w:val="0"/>
-        </w:rPr>
-      </w:r>
-    </w:p>
-    <w:p>
-      <w:pPr>
-        <w:spacing w:after="160" w:line="360" w:lineRule="auto"/>
-        <w:jc w:val="both"/>
-        <w:rPr>
-          <w:sz w:val="24"/>
-          <w:szCs w:val="24"/>
-        </w:rPr>
-      </w:pPr>
-      <w:r>
-        <w:rPr>
-          <w:sz w:val="24"/>
-          <w:szCs w:val="24"/>
-          <w:rtl w:val="0"/>
-        </w:rPr>
-        <w:t xml:space="preserve">The design applies the Open-Closed Principle by allowing new buyable or sellable items to be added without touching the action layer or the terminal, the Dependency Inversion Principle by writing the actions against interfaces, and the Single Responsibility Principle by keeping each class focused on one concern. The trade-off is a slightly larger number of small types, but this is justified by the way the system stays clean as items and effects multiply across later requirements.</w:t>
-      </w:r>
-    </w:p>
-    <w:p>
-      <w:pPr>
-        <w:spacing w:after="160" w:line="360" w:lineRule="auto"/>
-        <w:jc w:val="both"/>
-        <w:rPr>
-          <w:sz w:val="24"/>
-          <w:szCs w:val="24"/>
-        </w:rPr>
-      </w:pPr>
-      <w:r>
-        <w:rPr>
-          <w:rtl w:val="0"/>
-        </w:rPr>
-      </w:r>
-    </w:p>
-    <w:p>
-      <w:pPr>
-        <w:spacing w:after="160" w:line="360" w:lineRule="auto"/>
-        <w:jc w:val="both"/>
-        <w:rPr/>
-      </w:pPr>
-      <w:r>
-        <w:rPr>
-          <w:sz w:val="24"/>
-          <w:szCs w:val="24"/>
-          <w:rtl w:val="0"/>
-        </w:rPr>
-        <w:t xml:space="preserve">The alternative designs are shorter at first glance, but each one concentrates logic in a place that would have to be reopened and edited every time a new item, effect, or tier is introduced. The implemented design absorbs that growth through extension instead, which is the behaviour expected of an engine-based codebase of this size.</w:t>
-      </w:r>
-      <w:r>
-        <w:rPr>
-          <w:rtl w:val="0"/>
-        </w:rPr>
-      </w:r>
-    </w:p>
-    <w:p>
-      <w:pPr>
-        <w:rPr/>
-      </w:pPr>
-      <w:r>
-        <w:rPr>
-          <w:rtl w:val="0"/>
-        </w:rPr>
-      </w:r>
-    </w:p>
-    <w:p>
-      <w:pPr>
+        <w:t xml:space="preserve">The design absorbs growth through extension rather than modification. New sellable or purchasable items can be added by implementing the relevant interface and extending the factory method, without touching existing actions or the terminal. Actions depend on abstractions </w:t>
+      </w:r>
+      <w:r>
+        <w:rPr>
+          <w:i w:val="1"/>
+          <w:iCs w:val="1"/>
+          <w:sz w:val="24"/>
+          <w:szCs w:val="24"/>
+          <w:rtl w:val="0"/>
+        </w:rPr>
+        <w:t xml:space="preserve">(Buyable, Sellable)</w:t>
+      </w:r>
+      <w:r>
+        <w:rPr>
+          <w:sz w:val="24"/>
+          <w:szCs w:val="24"/>
+          <w:rtl w:val="0"/>
+        </w:rPr>
+        <w:t xml:space="preserve"> rather than concrete item classes, meaning high-level transaction logic is never affected by changes to individual items </w:t>
+      </w:r>
+      <w:r>
+        <w:rPr>
+          <w:b w:val="1"/>
+          <w:bCs w:val="1"/>
+          <w:sz w:val="24"/>
+          <w:szCs w:val="24"/>
+          <w:rtl w:val="0"/>
+        </w:rPr>
+        <w:t xml:space="preserve">(Dependency Inversion Principle)</w:t>
+      </w:r>
+      <w:r>
+        <w:rPr>
+          <w:sz w:val="24"/>
+          <w:szCs w:val="24"/>
+          <w:rtl w:val="0"/>
+        </w:rPr>
+        <w:t xml:space="preserve">. Access card tiers follow the same pattern; new tiers extend the hierarchy without modifying the shared parent or any other part of the system (</w:t>
+      </w:r>
+      <w:r>
+        <w:rPr>
+          <w:b w:val="1"/>
+          <w:bCs w:val="1"/>
+          <w:sz w:val="24"/>
+          <w:szCs w:val="24"/>
+          <w:rtl w:val="0"/>
+        </w:rPr>
+        <w:t xml:space="preserve">Open-Closed Principle)</w:t>
+      </w:r>
+      <w:r>
+        <w:rPr>
+          <w:sz w:val="24"/>
+          <w:szCs w:val="24"/>
+          <w:rtl w:val="0"/>
+        </w:rPr>
+        <w:t xml:space="preserve">. The trade-off is a larger number of small types, but this keeps each component focused and the system maintainable as the game grows across future requirements.</w:t>
+      </w:r>
+    </w:p>
+    <w:p>
+      <w:pPr>
+        <w:spacing w:line="360" w:lineRule="auto"/>
+        <w:rPr/>
+      </w:pPr>
+      <w:r>
+        <w:rPr>
+          <w:rtl w:val="0"/>
+        </w:rPr>
+      </w:r>
+    </w:p>
+    <w:p>
+      <w:pPr>
+        <w:spacing w:line="360" w:lineRule="auto"/>
         <w:rPr/>
       </w:pPr>
       <w:r>
@@ -5861,6 +5652,7 @@
     </w:p>
     <w:p>
       <w:pPr>
+        <w:spacing w:line="360" w:lineRule="auto"/>
         <w:rPr/>
       </w:pPr>
       <w:r>
@@ -5872,6 +5664,7 @@
     </w:p>
     <w:p>
       <w:pPr>
+        <w:spacing w:line="360" w:lineRule="auto"/>
         <w:rPr/>
       </w:pPr>
       <w:r>

</xml_diff>

<commit_message>
Updated REQ 1 DR
</commit_message>
<xml_diff>
--- a/docs/design/assignment2/REQ1/REQ1-DesignRationale.docx
+++ b/docs/design/assignment2/REQ1/REQ1-DesignRationale.docx
@@ -1718,7 +1718,7 @@
           <w:szCs w:val="24"/>
           <w:rtl w:val="0"/>
         </w:rPr>
-        <w:t xml:space="preserve">The ability to be purchased or sold is treated as a capability rather than an inherent property. The Buyable interface provides the contract for purchasable items, while the Sellable interface provides the equivalent for sellable items. Each concrete item implements whichever interface applies; FirstAidKit, SterilisationBox, and AccessCard implement Buyable, while Apple, CookiePack, Lantern, FloppyDisk, and CRTMonitor implement Sellable.</w:t>
+        <w:t xml:space="preserve">The ability to be purchased or sold is treated as a capability. The Buyable interface provides the contract for purchasable items, while Sellable does the same for sellable items. FirstAidKit, SterilisationBox, and AccessCard implement Buyable; Apple, CookiePack, Lantern, FloppyDisk, and CRTMonitor implement Sellable.</w:t>
       </w:r>
     </w:p>
     <w:p>
@@ -1737,167 +1737,7 @@
           <w:szCs w:val="24"/>
           <w:rtl w:val="0"/>
         </w:rPr>
-        <w:t xml:space="preserve">BuyAction and SellAction are written against these interfaces rather than concrete item classes. BuyAction orchestrates the purchase by checking the item’s price, verifying the actor has sufficient credits, deducting the cost, and delegating item-specific effects to the item’s boughtBy method. This keeps the action layer generic; BuyAction never needs to know whether it is handling a FirstAidKit or an AccessCard. Item-specific behaviour lives entirely inside each item’s boughtBy or soldBy method, so the action classes remain free of type checks and branching logic.</w:t>
-      </w:r>
-    </w:p>
-    <w:p>
-      <w:pPr>
-        <w:spacing w:after="160" w:line="360" w:lineRule="auto"/>
-        <w:ind w:left="0" w:firstLine="0"/>
-        <w:jc w:val="both"/>
-        <w:rPr>
-          <w:sz w:val="24"/>
-          <w:szCs w:val="24"/>
-        </w:rPr>
-      </w:pPr>
-      <w:r>
-        <w:rPr>
-          <w:rtl w:val="0"/>
-        </w:rPr>
-      </w:r>
-    </w:p>
-    <w:p>
-      <w:pPr>
-        <w:spacing w:after="160" w:line="360" w:lineRule="auto"/>
-        <w:ind w:left="0" w:firstLine="0"/>
-        <w:jc w:val="both"/>
-        <w:rPr>
-          <w:sz w:val="24"/>
-          <w:szCs w:val="24"/>
-        </w:rPr>
-      </w:pPr>
-      <w:r>
-        <w:rPr>
-          <w:rtl w:val="0"/>
-        </w:rPr>
-      </w:r>
-    </w:p>
-    <w:p>
-      <w:pPr>
-        <w:spacing w:after="160" w:line="360" w:lineRule="auto"/>
-        <w:ind w:left="0" w:firstLine="0"/>
-        <w:jc w:val="both"/>
-        <w:rPr>
-          <w:sz w:val="24"/>
-          <w:szCs w:val="24"/>
-        </w:rPr>
-      </w:pPr>
-      <w:r>
-        <w:rPr>
-          <w:rtl w:val="0"/>
-        </w:rPr>
-      </w:r>
-    </w:p>
-    <w:p>
-      <w:pPr>
-        <w:spacing w:after="160" w:line="360" w:lineRule="auto"/>
-        <w:ind w:left="0" w:firstLine="0"/>
-        <w:jc w:val="both"/>
-        <w:rPr>
-          <w:sz w:val="24"/>
-          <w:szCs w:val="24"/>
-        </w:rPr>
-      </w:pPr>
-      <w:r>
-        <w:rPr>
-          <w:rtl w:val="0"/>
-        </w:rPr>
-      </w:r>
-    </w:p>
-    <w:p>
-      <w:pPr>
-        <w:spacing w:after="160" w:line="360" w:lineRule="auto"/>
-        <w:ind w:left="0" w:firstLine="0"/>
-        <w:jc w:val="both"/>
-        <w:rPr>
-          <w:sz w:val="24"/>
-          <w:szCs w:val="24"/>
-        </w:rPr>
-      </w:pPr>
-      <w:r>
-        <w:rPr>
-          <w:rtl w:val="0"/>
-        </w:rPr>
-      </w:r>
-    </w:p>
-    <w:p>
-      <w:pPr>
-        <w:spacing w:after="160" w:line="360" w:lineRule="auto"/>
-        <w:ind w:left="0" w:firstLine="0"/>
-        <w:jc w:val="both"/>
-        <w:rPr>
-          <w:sz w:val="24"/>
-          <w:szCs w:val="24"/>
-        </w:rPr>
-      </w:pPr>
-      <w:r>
-        <w:rPr>
-          <w:rtl w:val="0"/>
-        </w:rPr>
-      </w:r>
-    </w:p>
-    <w:p>
-      <w:pPr>
-        <w:spacing w:after="160" w:line="360" w:lineRule="auto"/>
-        <w:ind w:left="0" w:firstLine="0"/>
-        <w:jc w:val="both"/>
-        <w:rPr>
-          <w:sz w:val="24"/>
-          <w:szCs w:val="24"/>
-        </w:rPr>
-      </w:pPr>
-      <w:r>
-        <w:rPr>
-          <w:rtl w:val="0"/>
-        </w:rPr>
-      </w:r>
-    </w:p>
-    <w:p>
-      <w:pPr>
-        <w:spacing w:after="160" w:line="360" w:lineRule="auto"/>
-        <w:ind w:left="0" w:firstLine="0"/>
-        <w:jc w:val="both"/>
-        <w:rPr>
-          <w:sz w:val="24"/>
-          <w:szCs w:val="24"/>
-        </w:rPr>
-      </w:pPr>
-      <w:r>
-        <w:rPr>
-          <w:rtl w:val="0"/>
-        </w:rPr>
-      </w:r>
-    </w:p>
-    <w:p>
-      <w:pPr>
-        <w:spacing w:after="160" w:line="360" w:lineRule="auto"/>
-        <w:ind w:left="0" w:firstLine="0"/>
-        <w:jc w:val="both"/>
-        <w:rPr>
-          <w:sz w:val="24"/>
-          <w:szCs w:val="24"/>
-        </w:rPr>
-      </w:pPr>
-      <w:r>
-        <w:rPr>
-          <w:rtl w:val="0"/>
-        </w:rPr>
-      </w:r>
-    </w:p>
-    <w:p>
-      <w:pPr>
-        <w:spacing w:after="160" w:line="360" w:lineRule="auto"/>
-        <w:ind w:left="0" w:firstLine="0"/>
-        <w:jc w:val="both"/>
-        <w:rPr>
-          <w:sz w:val="24"/>
-          <w:szCs w:val="24"/>
-        </w:rPr>
-      </w:pPr>
-      <w:r>
-        <w:rPr>
-          <w:rtl w:val="0"/>
-        </w:rPr>
+        <w:t xml:space="preserve">BuyAction and SellAction depend on these interfaces rather than concrete classes. BuyAction handles the purchase flow, delegating item-specific effects to the item’s boughtBy method, keeping the action layer generic. Item-specific behaviour lives entirely inside each item, so actions remain free of type checks.</w:t>
       </w:r>
     </w:p>
     <w:p>
@@ -2271,227 +2111,6 @@
     </w:tbl>
     <w:p>
       <w:pPr>
-        <w:spacing w:line="360" w:lineRule="auto"/>
-        <w:ind w:left="720" w:firstLine="0"/>
-        <w:jc w:val="both"/>
-        <w:rPr>
-          <w:sz w:val="24"/>
-          <w:szCs w:val="24"/>
-          <w:u w:val="single"/>
-        </w:rPr>
-      </w:pPr>
-      <w:r>
-        <w:rPr>
-          <w:rtl w:val="0"/>
-        </w:rPr>
-      </w:r>
-    </w:p>
-    <w:p>
-      <w:pPr>
-        <w:spacing w:line="360" w:lineRule="auto"/>
-        <w:ind w:left="720" w:firstLine="0"/>
-        <w:jc w:val="both"/>
-        <w:rPr>
-          <w:sz w:val="24"/>
-          <w:szCs w:val="24"/>
-          <w:u w:val="single"/>
-        </w:rPr>
-      </w:pPr>
-      <w:r>
-        <w:rPr>
-          <w:rtl w:val="0"/>
-        </w:rPr>
-      </w:r>
-    </w:p>
-    <w:p>
-      <w:pPr>
-        <w:spacing w:line="360" w:lineRule="auto"/>
-        <w:ind w:left="720" w:firstLine="0"/>
-        <w:jc w:val="both"/>
-        <w:rPr>
-          <w:sz w:val="24"/>
-          <w:szCs w:val="24"/>
-          <w:u w:val="single"/>
-        </w:rPr>
-      </w:pPr>
-      <w:r>
-        <w:rPr>
-          <w:rtl w:val="0"/>
-        </w:rPr>
-      </w:r>
-    </w:p>
-    <w:p>
-      <w:pPr>
-        <w:spacing w:line="360" w:lineRule="auto"/>
-        <w:ind w:left="720" w:firstLine="0"/>
-        <w:jc w:val="both"/>
-        <w:rPr>
-          <w:sz w:val="24"/>
-          <w:szCs w:val="24"/>
-          <w:u w:val="single"/>
-        </w:rPr>
-      </w:pPr>
-      <w:r>
-        <w:rPr>
-          <w:rtl w:val="0"/>
-        </w:rPr>
-      </w:r>
-    </w:p>
-    <w:p>
-      <w:pPr>
-        <w:spacing w:line="360" w:lineRule="auto"/>
-        <w:ind w:left="720" w:firstLine="0"/>
-        <w:jc w:val="both"/>
-        <w:rPr>
-          <w:sz w:val="24"/>
-          <w:szCs w:val="24"/>
-          <w:u w:val="single"/>
-        </w:rPr>
-      </w:pPr>
-      <w:r>
-        <w:rPr>
-          <w:rtl w:val="0"/>
-        </w:rPr>
-      </w:r>
-    </w:p>
-    <w:p>
-      <w:pPr>
-        <w:spacing w:line="360" w:lineRule="auto"/>
-        <w:ind w:left="720" w:firstLine="0"/>
-        <w:jc w:val="both"/>
-        <w:rPr>
-          <w:sz w:val="24"/>
-          <w:szCs w:val="24"/>
-          <w:u w:val="single"/>
-        </w:rPr>
-      </w:pPr>
-      <w:r>
-        <w:rPr>
-          <w:rtl w:val="0"/>
-        </w:rPr>
-      </w:r>
-    </w:p>
-    <w:p>
-      <w:pPr>
-        <w:spacing w:line="360" w:lineRule="auto"/>
-        <w:ind w:left="720" w:firstLine="0"/>
-        <w:jc w:val="both"/>
-        <w:rPr>
-          <w:sz w:val="24"/>
-          <w:szCs w:val="24"/>
-          <w:u w:val="single"/>
-        </w:rPr>
-      </w:pPr>
-      <w:r>
-        <w:rPr>
-          <w:rtl w:val="0"/>
-        </w:rPr>
-      </w:r>
-    </w:p>
-    <w:p>
-      <w:pPr>
-        <w:spacing w:line="360" w:lineRule="auto"/>
-        <w:ind w:left="720" w:firstLine="0"/>
-        <w:jc w:val="both"/>
-        <w:rPr>
-          <w:sz w:val="24"/>
-          <w:szCs w:val="24"/>
-          <w:u w:val="single"/>
-        </w:rPr>
-      </w:pPr>
-      <w:r>
-        <w:rPr>
-          <w:rtl w:val="0"/>
-        </w:rPr>
-      </w:r>
-    </w:p>
-    <w:p>
-      <w:pPr>
-        <w:spacing w:line="360" w:lineRule="auto"/>
-        <w:ind w:left="720" w:firstLine="0"/>
-        <w:jc w:val="both"/>
-        <w:rPr>
-          <w:sz w:val="24"/>
-          <w:szCs w:val="24"/>
-          <w:u w:val="single"/>
-        </w:rPr>
-      </w:pPr>
-      <w:r>
-        <w:rPr>
-          <w:rtl w:val="0"/>
-        </w:rPr>
-      </w:r>
-    </w:p>
-    <w:p>
-      <w:pPr>
-        <w:spacing w:line="360" w:lineRule="auto"/>
-        <w:ind w:left="720" w:firstLine="0"/>
-        <w:jc w:val="both"/>
-        <w:rPr>
-          <w:sz w:val="24"/>
-          <w:szCs w:val="24"/>
-          <w:u w:val="single"/>
-        </w:rPr>
-      </w:pPr>
-      <w:r>
-        <w:rPr>
-          <w:rtl w:val="0"/>
-        </w:rPr>
-      </w:r>
-    </w:p>
-    <w:p>
-      <w:pPr>
-        <w:spacing w:line="360" w:lineRule="auto"/>
-        <w:ind w:left="720" w:firstLine="0"/>
-        <w:jc w:val="both"/>
-        <w:rPr>
-          <w:sz w:val="24"/>
-          <w:szCs w:val="24"/>
-          <w:u w:val="single"/>
-        </w:rPr>
-      </w:pPr>
-      <w:r>
-        <w:rPr>
-          <w:rtl w:val="0"/>
-        </w:rPr>
-      </w:r>
-    </w:p>
-    <w:p>
-      <w:pPr>
-        <w:spacing w:line="360" w:lineRule="auto"/>
-        <w:ind w:left="720" w:firstLine="0"/>
-        <w:jc w:val="both"/>
-        <w:rPr>
-          <w:sz w:val="24"/>
-          <w:szCs w:val="24"/>
-          <w:u w:val="single"/>
-        </w:rPr>
-      </w:pPr>
-      <w:r>
-        <w:rPr>
-          <w:rtl w:val="0"/>
-        </w:rPr>
-      </w:r>
-    </w:p>
-    <w:p>
-      <w:pPr>
-        <w:spacing w:line="360" w:lineRule="auto"/>
-        <w:ind w:left="720" w:firstLine="0"/>
-        <w:jc w:val="both"/>
-        <w:rPr>
-          <w:sz w:val="24"/>
-          <w:szCs w:val="24"/>
-          <w:u w:val="single"/>
-        </w:rPr>
-      </w:pPr>
-      <w:r>
-        <w:rPr>
-          <w:rtl w:val="0"/>
-        </w:rPr>
-      </w:r>
-    </w:p>
-    <w:p>
-      <w:pPr>
         <w:pStyle w:val="Heading3"/>
         <w:spacing w:after="160" w:before="160" w:line="360" w:lineRule="auto"/>
         <w:ind w:firstLine="720"/>
@@ -3010,7 +2629,7 @@
           <w:szCs w:val="24"/>
           <w:rtl w:val="0"/>
         </w:rPr>
-        <w:t xml:space="preserve">Item side-effects (poison, burn, fire) are modelled as Status objects that integrate with the engine’s existing per-turn lifecycle, so effects expire and apply damage automatically without any custom tracking code in the actor. Actors declare which effects they can receive through capability interfaces (Poisonable, Flammable). Items query whether an actor supports a given capability before applying an effect, avoiding type checks against concrete actor classes. Environmental effects such as Fire spawning on adjacent tiles are treated as ordinary items added to the map through the engine’s existing item-placement system, keeping the effects model consistent across the whole codebase.</w:t>
+        <w:t xml:space="preserve">Item side-effects (poison, burn, fire) are modelled as Status objects that integrate with the engine’s per-turn lifecycle, so effects expire automatically without custom tracking. Actors declare supported effects through capability interfaces (Poisonable, Flammable), allowing items to apply effects without type checks. Environmental effects like Fire are treated as ordinary items, keeping the model consistent.</w:t>
       </w:r>
     </w:p>
     <w:p>
@@ -3025,11 +2644,85 @@
       </w:pPr>
       <w:r>
         <w:rPr>
-          <w:sz w:val="24"/>
-          <w:szCs w:val="24"/>
-          <w:rtl w:val="0"/>
-        </w:rPr>
-        <w:t xml:space="preserve">Note that item prices and side-effect values (e.g., poison duration, burn damage, spawn chances) have been declared as named constants within each item class rather than hardcoded literals scattered throughout methods. This eliminates connascence of meaning, changing it into connascence of name (weaker), improving readability and maintainability. For example, if Apple’s poison effect needs adjustment, modifying a single constant ensures consistency rather than hunting through multiple method calls.</w:t>
+          <w:b w:val="1"/>
+          <w:bCs w:val="1"/>
+          <w:sz w:val="24"/>
+          <w:szCs w:val="24"/>
+          <w:rtl w:val="0"/>
+        </w:rPr>
+        <w:t xml:space="preserve">Note</w:t>
+      </w:r>
+      <w:r>
+        <w:rPr>
+          <w:sz w:val="24"/>
+          <w:szCs w:val="24"/>
+          <w:rtl w:val="0"/>
+        </w:rPr>
+        <w:t xml:space="preserve"> that item prices and side-effect values have been declared as named constants within each item class, eliminating connascence of meaning and changing it into connascence of name (weaker). This improves maintainability; adjusting effects requires modifying a single constant rather than hunting through multiple method calls.</w:t>
+      </w:r>
+    </w:p>
+    <w:p>
+      <w:pPr>
+        <w:spacing w:after="160" w:line="360" w:lineRule="auto"/>
+        <w:ind w:left="720" w:firstLine="0"/>
+        <w:jc w:val="both"/>
+        <w:rPr>
+          <w:sz w:val="24"/>
+          <w:szCs w:val="24"/>
+        </w:rPr>
+      </w:pPr>
+      <w:r>
+        <w:rPr>
+          <w:rtl w:val="0"/>
+        </w:rPr>
+      </w:r>
+    </w:p>
+    <w:p>
+      <w:pPr>
+        <w:spacing w:after="160" w:line="360" w:lineRule="auto"/>
+        <w:ind w:left="720" w:firstLine="0"/>
+        <w:jc w:val="both"/>
+        <w:rPr>
+          <w:sz w:val="24"/>
+          <w:szCs w:val="24"/>
+        </w:rPr>
+      </w:pPr>
+      <w:r>
+        <w:rPr>
+          <w:rtl w:val="0"/>
+        </w:rPr>
+      </w:r>
+    </w:p>
+    <w:p>
+      <w:pPr>
+        <w:spacing w:after="160" w:line="360" w:lineRule="auto"/>
+        <w:ind w:left="720" w:firstLine="0"/>
+        <w:jc w:val="both"/>
+        <w:rPr>
+          <w:sz w:val="24"/>
+          <w:szCs w:val="24"/>
+        </w:rPr>
+      </w:pPr>
+      <w:r>
+        <w:rPr>
+          <w:rtl w:val="0"/>
+        </w:rPr>
+      </w:r>
+    </w:p>
+    <w:p>
+      <w:pPr>
+        <w:spacing w:after="160" w:line="360" w:lineRule="auto"/>
+        <w:ind w:left="720" w:firstLine="0"/>
+        <w:jc w:val="both"/>
+        <w:rPr>
+          <w:sz w:val="24"/>
+          <w:szCs w:val="24"/>
+        </w:rPr>
+      </w:pPr>
+      <w:r>
+        <w:rPr>
+          <w:rtl w:val="0"/>
+        </w:rPr>
       </w:r>
     </w:p>
     <w:p>

</xml_diff>